<commit_message>
Document the agent-script bug and the 18-operation check
Co-Authored-By: Claude Opus 5 <noreply@anthropic.com>
</commit_message>
<xml_diff>
--- a/docs/voice-platform/20-admin-dashboard-vaani-cutover-2026-09-03.docx
+++ b/docs/voice-platform/20-admin-dashboard-vaani-cutover-2026-09-03.docx
@@ -3472,6 +3472,992 @@
     </w:p>
     <w:p>
       <w:pPr>
+        <w:pStyle w:val="Heading2"/>
+      </w:pPr>
+      <w:r>
+        <w:rPr>
+          <w:rFonts w:ascii="Nirmala UI" w:hAnsi="Nirmala UI" w:eastAsia="Nirmala UI" w:cs="Nirmala UI"/>
+          <w:color w:val="1F4E79"/>
+        </w:rPr>
+        <w:t>4. The AI Agent page could not show a script, and its save button destroyed one</w:t>
+      </w:r>
+    </w:p>
+    <w:p>
+      <w:pPr>
+        <w:spacing w:after="120"/>
+      </w:pPr>
+      <w:r>
+        <w:rPr>
+          <w:rFonts w:ascii="Nirmala UI" w:hAnsi="Nirmala UI" w:eastAsia="Nirmala UI" w:cs="Nirmala UI"/>
+        </w:rPr>
+        <w:t>Reported as "I am not able to see the agent scripts". Two bugs, same cause.</w:t>
+      </w:r>
+    </w:p>
+    <w:p>
+      <w:pPr>
+        <w:spacing w:after="120"/>
+      </w:pPr>
+      <w:r>
+        <w:rPr>
+          <w:rFonts w:ascii="Nirmala UI" w:hAnsi="Nirmala UI" w:eastAsia="Nirmala UI" w:cs="Nirmala UI"/>
+        </w:rPr>
+        <w:t xml:space="preserve">A Vaani agent keeps two very different pieces of text on </w:t>
+      </w:r>
+      <w:r>
+        <w:rPr>
+          <w:rFonts w:ascii="Nirmala UI" w:hAnsi="Nirmala UI" w:eastAsia="Nirmala UI" w:cs="Nirmala UI"/>
+          <w:b/>
+        </w:rPr>
+        <w:t>one</w:t>
+      </w:r>
+      <w:r>
+        <w:rPr>
+          <w:rFonts w:ascii="Nirmala UI" w:hAnsi="Nirmala UI" w:eastAsia="Nirmala UI" w:cs="Nirmala UI"/>
+        </w:rPr>
+        <w:t xml:space="preserve"> node:</w:t>
+      </w:r>
+    </w:p>
+    <w:tbl>
+      <w:tblPr>
+        <w:tblStyle w:val="TableGrid"/>
+        <w:tblW w:type="auto" w:w="0"/>
+        <w:jc w:val="center"/>
+        <w:tblLook w:firstColumn="1" w:firstRow="1" w:lastColumn="0" w:lastRow="0" w:noHBand="0" w:noVBand="1" w:val="04A0"/>
+      </w:tblPr>
+      <w:tblGrid>
+        <w:gridCol w:w="2880"/>
+        <w:gridCol w:w="2880"/>
+        <w:gridCol w:w="2880"/>
+      </w:tblGrid>
+      <w:tr>
+        <w:tc>
+          <w:tcPr>
+            <w:tcW w:type="dxa" w:w="2880"/>
+            <w:shd w:val="clear" w:color="auto" w:fill="DCE6F1"/>
+          </w:tcPr>
+          <w:p>
+            <w:pPr>
+              <w:spacing w:before="40" w:after="40"/>
+            </w:pPr>
+            <w:r>
+              <w:rPr>
+                <w:rFonts w:ascii="Nirmala UI" w:hAnsi="Nirmala UI" w:eastAsia="Nirmala UI" w:cs="Nirmala UI"/>
+                <w:b/>
+                <w:sz w:val="18"/>
+              </w:rPr>
+              <w:t>field</w:t>
+            </w:r>
+          </w:p>
+        </w:tc>
+        <w:tc>
+          <w:tcPr>
+            <w:tcW w:type="dxa" w:w="2880"/>
+            <w:shd w:val="clear" w:color="auto" w:fill="DCE6F1"/>
+          </w:tcPr>
+          <w:p>
+            <w:pPr>
+              <w:spacing w:before="40" w:after="40"/>
+            </w:pPr>
+            <w:r>
+              <w:rPr>
+                <w:rFonts w:ascii="Nirmala UI" w:hAnsi="Nirmala UI" w:eastAsia="Nirmala UI" w:cs="Nirmala UI"/>
+                <w:b/>
+                <w:sz w:val="18"/>
+              </w:rPr>
+              <w:t>loan agent</w:t>
+            </w:r>
+          </w:p>
+        </w:tc>
+        <w:tc>
+          <w:tcPr>
+            <w:tcW w:type="dxa" w:w="2880"/>
+            <w:shd w:val="clear" w:color="auto" w:fill="DCE6F1"/>
+          </w:tcPr>
+          <w:p>
+            <w:pPr>
+              <w:spacing w:before="40" w:after="40"/>
+            </w:pPr>
+            <w:r>
+              <w:rPr>
+                <w:rFonts w:ascii="Nirmala UI" w:hAnsi="Nirmala UI" w:eastAsia="Nirmala UI" w:cs="Nirmala UI"/>
+                <w:b/>
+                <w:sz w:val="18"/>
+              </w:rPr>
+              <w:t>what it is</w:t>
+            </w:r>
+          </w:p>
+        </w:tc>
+      </w:tr>
+      <w:tr>
+        <w:tc>
+          <w:tcPr>
+            <w:tcW w:type="dxa" w:w="2880"/>
+          </w:tcPr>
+          <w:p>
+            <w:pPr>
+              <w:spacing w:before="40" w:after="40"/>
+            </w:pPr>
+            <w:r>
+              <w:rPr>
+                <w:rFonts w:ascii="Consolas" w:hAnsi="Consolas" w:eastAsia="Consolas" w:cs="Consolas"/>
+                <w:color w:val="A31D1D"/>
+                <w:sz w:val="18"/>
+              </w:rPr>
+              <w:t>data.greeting</w:t>
+            </w:r>
+          </w:p>
+        </w:tc>
+        <w:tc>
+          <w:tcPr>
+            <w:tcW w:type="dxa" w:w="2880"/>
+          </w:tcPr>
+          <w:p>
+            <w:pPr>
+              <w:spacing w:before="40" w:after="40"/>
+            </w:pPr>
+            <w:r>
+              <w:rPr>
+                <w:rFonts w:ascii="Nirmala UI" w:hAnsi="Nirmala UI" w:eastAsia="Nirmala UI" w:cs="Nirmala UI"/>
+                <w:sz w:val="18"/>
+              </w:rPr>
+              <w:t>88 chars</w:t>
+            </w:r>
+          </w:p>
+        </w:tc>
+        <w:tc>
+          <w:tcPr>
+            <w:tcW w:type="dxa" w:w="2880"/>
+          </w:tcPr>
+          <w:p>
+            <w:pPr>
+              <w:spacing w:before="40" w:after="40"/>
+            </w:pPr>
+            <w:r>
+              <w:rPr>
+                <w:rFonts w:ascii="Nirmala UI" w:hAnsi="Nirmala UI" w:eastAsia="Nirmala UI" w:cs="Nirmala UI"/>
+                <w:sz w:val="18"/>
+              </w:rPr>
+              <w:t>the opening line, spoken verbatim</w:t>
+            </w:r>
+          </w:p>
+        </w:tc>
+      </w:tr>
+      <w:tr>
+        <w:tc>
+          <w:tcPr>
+            <w:tcW w:type="dxa" w:w="2880"/>
+          </w:tcPr>
+          <w:p>
+            <w:pPr>
+              <w:spacing w:before="40" w:after="40"/>
+            </w:pPr>
+            <w:r>
+              <w:rPr>
+                <w:rFonts w:ascii="Consolas" w:hAnsi="Consolas" w:eastAsia="Consolas" w:cs="Consolas"/>
+                <w:color w:val="A31D1D"/>
+                <w:sz w:val="18"/>
+              </w:rPr>
+              <w:t>data.prompt</w:t>
+            </w:r>
+          </w:p>
+        </w:tc>
+        <w:tc>
+          <w:tcPr>
+            <w:tcW w:type="dxa" w:w="2880"/>
+          </w:tcPr>
+          <w:p>
+            <w:pPr>
+              <w:spacing w:before="40" w:after="40"/>
+            </w:pPr>
+            <w:r>
+              <w:rPr>
+                <w:rFonts w:ascii="Nirmala UI" w:hAnsi="Nirmala UI" w:eastAsia="Nirmala UI" w:cs="Nirmala UI"/>
+                <w:b/>
+                <w:sz w:val="18"/>
+              </w:rPr>
+              <w:t>4,302 chars</w:t>
+            </w:r>
+          </w:p>
+        </w:tc>
+        <w:tc>
+          <w:tcPr>
+            <w:tcW w:type="dxa" w:w="2880"/>
+          </w:tcPr>
+          <w:p>
+            <w:pPr>
+              <w:spacing w:before="40" w:after="40"/>
+            </w:pPr>
+            <w:r>
+              <w:rPr>
+                <w:rFonts w:ascii="Nirmala UI" w:hAnsi="Nirmala UI" w:eastAsia="Nirmala UI" w:cs="Nirmala UI"/>
+                <w:sz w:val="18"/>
+              </w:rPr>
+              <w:t>the script driving the rest of the call</w:t>
+            </w:r>
+          </w:p>
+        </w:tc>
+      </w:tr>
+    </w:tbl>
+    <w:p/>
+    <w:p>
+      <w:pPr>
+        <w:spacing w:after="120"/>
+      </w:pPr>
+      <w:r>
+        <w:rPr>
+          <w:rFonts w:ascii="Consolas" w:hAnsi="Consolas" w:eastAsia="Consolas" w:cs="Consolas"/>
+          <w:color w:val="A31D1D"/>
+          <w:sz w:val="18"/>
+        </w:rPr>
+        <w:t>app/api/agent/prompts/route.ts</w:t>
+      </w:r>
+      <w:r>
+        <w:rPr>
+          <w:rFonts w:ascii="Nirmala UI" w:hAnsi="Nirmala UI" w:eastAsia="Nirmala UI" w:cs="Nirmala UI"/>
+        </w:rPr>
+        <w:t xml:space="preserve"> was written for the older four-node graph,</w:t>
+      </w:r>
+    </w:p>
+    <w:p>
+      <w:pPr>
+        <w:spacing w:after="120"/>
+      </w:pPr>
+      <w:r>
+        <w:rPr>
+          <w:rFonts w:ascii="Nirmala UI" w:hAnsi="Nirmala UI" w:eastAsia="Nirmala UI" w:cs="Nirmala UI"/>
+        </w:rPr>
+        <w:t>where a start node had one piece of text worth editing. So:</w:t>
+      </w:r>
+    </w:p>
+    <w:p>
+      <w:pPr>
+        <w:pStyle w:val="ListBullet"/>
+      </w:pPr>
+      <w:r>
+        <w:rPr>
+          <w:rFonts w:ascii="Nirmala UI" w:hAnsi="Nirmala UI" w:eastAsia="Nirmala UI" w:cs="Nirmala UI"/>
+          <w:b/>
+        </w:rPr>
+        <w:t>The script was never sent to the browser.</w:t>
+      </w:r>
+      <w:r>
+        <w:rPr>
+          <w:rFonts w:ascii="Nirmala UI" w:hAnsi="Nirmala UI" w:eastAsia="Nirmala UI" w:cs="Nirmala UI"/>
+        </w:rPr>
+        <w:t xml:space="preserve"> </w:t>
+      </w:r>
+      <w:r>
+        <w:rPr>
+          <w:rFonts w:ascii="Consolas" w:hAnsi="Consolas" w:eastAsia="Consolas" w:cs="Consolas"/>
+          <w:color w:val="A31D1D"/>
+          <w:sz w:val="18"/>
+        </w:rPr>
+        <w:t>readNodeText</w:t>
+      </w:r>
+      <w:r>
+        <w:rPr>
+          <w:rFonts w:ascii="Nirmala UI" w:hAnsi="Nirmala UI" w:eastAsia="Nirmala UI" w:cs="Nirmala UI"/>
+        </w:rPr>
+        <w:t xml:space="preserve"> returns the</w:t>
+      </w:r>
+    </w:p>
+    <w:p>
+      <w:pPr>
+        <w:spacing w:after="120"/>
+      </w:pPr>
+      <w:r>
+        <w:rPr>
+          <w:rFonts w:ascii="Nirmala UI" w:hAnsi="Nirmala UI" w:eastAsia="Nirmala UI" w:cs="Nirmala UI"/>
+        </w:rPr>
+        <w:t>greeting and stops. The page showed an 88-character opening line, plus three</w:t>
+      </w:r>
+    </w:p>
+    <w:p>
+      <w:pPr>
+        <w:spacing w:after="120"/>
+      </w:pPr>
+      <w:r>
+        <w:rPr>
+          <w:rFonts w:ascii="Nirmala UI" w:hAnsi="Nirmala UI" w:eastAsia="Nirmala UI" w:cs="Nirmala UI"/>
+        </w:rPr>
+        <w:t>permanently empty boxes for parts these agents do not have — which reads as</w:t>
+      </w:r>
+    </w:p>
+    <w:p>
+      <w:pPr>
+        <w:spacing w:after="120"/>
+      </w:pPr>
+      <w:r>
+        <w:rPr>
+          <w:rFonts w:ascii="Nirmala UI" w:hAnsi="Nirmala UI" w:eastAsia="Nirmala UI" w:cs="Nirmala UI"/>
+        </w:rPr>
+        <w:t>the script having been lost.</w:t>
+      </w:r>
+    </w:p>
+    <w:p>
+      <w:pPr>
+        <w:pStyle w:val="ListBullet"/>
+      </w:pPr>
+      <w:r>
+        <w:rPr>
+          <w:rFonts w:ascii="Nirmala UI" w:hAnsi="Nirmala UI" w:eastAsia="Nirmala UI" w:cs="Nirmala UI"/>
+          <w:b/>
+        </w:rPr>
+        <w:t>Saving the opening line would have destroyed the script.</w:t>
+      </w:r>
+      <w:r>
+        <w:rPr>
+          <w:rFonts w:ascii="Nirmala UI" w:hAnsi="Nirmala UI" w:eastAsia="Nirmala UI" w:cs="Nirmala UI"/>
+        </w:rPr>
+        <w:t xml:space="preserve"> The save path set</w:t>
+      </w:r>
+    </w:p>
+    <w:p>
+      <w:pPr>
+        <w:spacing w:after="120"/>
+      </w:pPr>
+      <w:r>
+        <w:rPr>
+          <w:rFonts w:ascii="Consolas" w:hAnsi="Consolas" w:eastAsia="Consolas" w:cs="Consolas"/>
+          <w:color w:val="A31D1D"/>
+          <w:sz w:val="18"/>
+        </w:rPr>
+        <w:t>node.data.prompt = start</w:t>
+      </w:r>
+      <w:r>
+        <w:rPr>
+          <w:rFonts w:ascii="Nirmala UI" w:hAnsi="Nirmala UI" w:eastAsia="Nirmala UI" w:cs="Nirmala UI"/>
+        </w:rPr>
+        <w:t xml:space="preserve"> as well as the greeting, then published. Pressing</w:t>
+      </w:r>
+    </w:p>
+    <w:p>
+      <w:pPr>
+        <w:spacing w:after="120"/>
+      </w:pPr>
+      <w:r>
+        <w:rPr>
+          <w:rFonts w:ascii="Nirmala UI" w:hAnsi="Nirmala UI" w:eastAsia="Nirmala UI" w:cs="Nirmala UI"/>
+        </w:rPr>
+        <w:t>Save on the opening line would have replaced all 4,302 characters of the loan</w:t>
+      </w:r>
+    </w:p>
+    <w:p>
+      <w:pPr>
+        <w:spacing w:after="120"/>
+      </w:pPr>
+      <w:r>
+        <w:rPr>
+          <w:rFonts w:ascii="Nirmala UI" w:hAnsi="Nirmala UI" w:eastAsia="Nirmala UI" w:cs="Nirmala UI"/>
+        </w:rPr>
+        <w:t>script with one sentence, live on the phone line. Nobody pressed it.</w:t>
+      </w:r>
+    </w:p>
+    <w:p>
+      <w:pPr>
+        <w:pStyle w:val="ListBullet"/>
+      </w:pPr>
+      <w:r>
+        <w:rPr>
+          <w:rFonts w:ascii="Consolas" w:hAnsi="Consolas" w:eastAsia="Consolas" w:cs="Consolas"/>
+          <w:color w:val="A31D1D"/>
+          <w:sz w:val="18"/>
+        </w:rPr>
+        <w:t>MAX_PROMPT_LENGTH</w:t>
+      </w:r>
+      <w:r>
+        <w:rPr>
+          <w:rFonts w:ascii="Nirmala UI" w:hAnsi="Nirmala UI" w:eastAsia="Nirmala UI" w:cs="Nirmala UI"/>
+        </w:rPr>
+        <w:t xml:space="preserve"> was </w:t>
+      </w:r>
+      <w:r>
+        <w:rPr>
+          <w:rFonts w:ascii="Nirmala UI" w:hAnsi="Nirmala UI" w:eastAsia="Nirmala UI" w:cs="Nirmala UI"/>
+          <w:b/>
+        </w:rPr>
+        <w:t>4000</w:t>
+      </w:r>
+      <w:r>
+        <w:rPr>
+          <w:rFonts w:ascii="Nirmala UI" w:hAnsi="Nirmala UI" w:eastAsia="Nirmala UI" w:cs="Nirmala UI"/>
+        </w:rPr>
+        <w:t xml:space="preserve"> — shorter than the loan script — so that</w:t>
+      </w:r>
+    </w:p>
+    <w:p>
+      <w:pPr>
+        <w:spacing w:after="120"/>
+      </w:pPr>
+      <w:r>
+        <w:rPr>
+          <w:rFonts w:ascii="Nirmala UI" w:hAnsi="Nirmala UI" w:eastAsia="Nirmala UI" w:cs="Nirmala UI"/>
+        </w:rPr>
+        <w:t>script could not have been saved even through a correct path.</w:t>
+      </w:r>
+    </w:p>
+    <w:p>
+      <w:pPr>
+        <w:spacing w:after="120"/>
+      </w:pPr>
+      <w:r>
+        <w:rPr>
+          <w:rFonts w:ascii="Nirmala UI" w:hAnsi="Nirmala UI" w:eastAsia="Nirmala UI" w:cs="Nirmala UI"/>
+        </w:rPr>
+        <w:t xml:space="preserve">The two fields are now addressed separately: </w:t>
+      </w:r>
+      <w:r>
+        <w:rPr>
+          <w:rFonts w:ascii="Consolas" w:hAnsi="Consolas" w:eastAsia="Consolas" w:cs="Consolas"/>
+          <w:color w:val="A31D1D"/>
+          <w:sz w:val="18"/>
+        </w:rPr>
+        <w:t>start</w:t>
+      </w:r>
+      <w:r>
+        <w:rPr>
+          <w:rFonts w:ascii="Nirmala UI" w:hAnsi="Nirmala UI" w:eastAsia="Nirmala UI" w:cs="Nirmala UI"/>
+        </w:rPr>
+        <w:t xml:space="preserve"> writes only the greeting on</w:t>
+      </w:r>
+    </w:p>
+    <w:p>
+      <w:pPr>
+        <w:spacing w:after="120"/>
+      </w:pPr>
+      <w:r>
+        <w:rPr>
+          <w:rFonts w:ascii="Nirmala UI" w:hAnsi="Nirmala UI" w:eastAsia="Nirmala UI" w:cs="Nirmala UI"/>
+        </w:rPr>
+        <w:t xml:space="preserve">a </w:t>
+      </w:r>
+      <w:r>
+        <w:rPr>
+          <w:rFonts w:ascii="Consolas" w:hAnsi="Consolas" w:eastAsia="Consolas" w:cs="Consolas"/>
+          <w:color w:val="A31D1D"/>
+          <w:sz w:val="18"/>
+        </w:rPr>
+        <w:t>greeting_type: 'text'</w:t>
+      </w:r>
+      <w:r>
+        <w:rPr>
+          <w:rFonts w:ascii="Nirmala UI" w:hAnsi="Nirmala UI" w:eastAsia="Nirmala UI" w:cs="Nirmala UI"/>
+        </w:rPr>
+        <w:t xml:space="preserve"> node, and a new </w:t>
+      </w:r>
+      <w:r>
+        <w:rPr>
+          <w:rFonts w:ascii="Consolas" w:hAnsi="Consolas" w:eastAsia="Consolas" w:cs="Consolas"/>
+          <w:color w:val="A31D1D"/>
+          <w:sz w:val="18"/>
+        </w:rPr>
+        <w:t>script</w:t>
+      </w:r>
+      <w:r>
+        <w:rPr>
+          <w:rFonts w:ascii="Nirmala UI" w:hAnsi="Nirmala UI" w:eastAsia="Nirmala UI" w:cs="Nirmala UI"/>
+        </w:rPr>
+        <w:t xml:space="preserve"> key writes only the prompt.</w:t>
+      </w:r>
+    </w:p>
+    <w:p>
+      <w:pPr>
+        <w:spacing w:after="120"/>
+      </w:pPr>
+      <w:r>
+        <w:rPr>
+          <w:rFonts w:ascii="Consolas" w:hAnsi="Consolas" w:eastAsia="Consolas" w:cs="Consolas"/>
+          <w:color w:val="A31D1D"/>
+          <w:sz w:val="18"/>
+        </w:rPr>
+        <w:t>llm</w:t>
+      </w:r>
+      <w:r>
+        <w:rPr>
+          <w:rFonts w:ascii="Nirmala UI" w:hAnsi="Nirmala UI" w:eastAsia="Nirmala UI" w:cs="Nirmala UI"/>
+        </w:rPr>
+        <w:t>-mode start nodes still write both, because there the greeting genuinely is</w:t>
+      </w:r>
+    </w:p>
+    <w:p>
+      <w:pPr>
+        <w:spacing w:after="120"/>
+      </w:pPr>
+      <w:r>
+        <w:rPr>
+          <w:rFonts w:ascii="Nirmala UI" w:hAnsi="Nirmala UI" w:eastAsia="Nirmala UI" w:cs="Nirmala UI"/>
+        </w:rPr>
+        <w:t>generated from the prompt. The cap is 20,000. The page renders only the blocks</w:t>
+      </w:r>
+    </w:p>
+    <w:p>
+      <w:pPr>
+        <w:spacing w:after="120"/>
+      </w:pPr>
+      <w:r>
+        <w:rPr>
+          <w:rFonts w:ascii="Nirmala UI" w:hAnsi="Nirmala UI" w:eastAsia="Nirmala UI" w:cs="Nirmala UI"/>
+        </w:rPr>
+        <w:t>the loaded agent actually has, and gives the script a tall monospace box.</w:t>
+      </w:r>
+    </w:p>
+    <w:p>
+      <w:pPr>
+        <w:spacing w:after="120"/>
+      </w:pPr>
+      <w:r>
+        <w:rPr>
+          <w:rFonts w:ascii="Nirmala UI" w:hAnsi="Nirmala UI" w:eastAsia="Nirmala UI" w:cs="Nirmala UI"/>
+        </w:rPr>
+        <w:t>Eleven tests pin it, including the exact regression: editing the opening line</w:t>
+      </w:r>
+    </w:p>
+    <w:p>
+      <w:pPr>
+        <w:spacing w:after="120"/>
+      </w:pPr>
+      <w:r>
+        <w:rPr>
+          <w:rFonts w:ascii="Nirmala UI" w:hAnsi="Nirmala UI" w:eastAsia="Nirmala UI" w:cs="Nirmala UI"/>
+        </w:rPr>
+        <w:t>must leave the script byte-identical.</w:t>
+      </w:r>
+    </w:p>
+    <w:p>
+      <w:pPr>
+        <w:pStyle w:val="Heading1"/>
+      </w:pPr>
+      <w:r>
+        <w:rPr>
+          <w:rFonts w:ascii="Nirmala UI" w:hAnsi="Nirmala UI" w:eastAsia="Nirmala UI" w:cs="Nirmala UI"/>
+          <w:color w:val="1F4E79"/>
+        </w:rPr>
+        <w:t>Every dashboard operation, checked against Vaani</w:t>
+      </w:r>
+    </w:p>
+    <w:p>
+      <w:pPr>
+        <w:spacing w:after="120"/>
+      </w:pPr>
+      <w:r>
+        <w:rPr>
+          <w:rFonts w:ascii="Nirmala UI" w:hAnsi="Nirmala UI" w:eastAsia="Nirmala UI" w:cs="Nirmala UI"/>
+        </w:rPr>
+        <w:t>All 18 endpoints the dashboard depends on answer correctly — verified read-only,</w:t>
+      </w:r>
+    </w:p>
+    <w:p>
+      <w:pPr>
+        <w:spacing w:after="120"/>
+      </w:pPr>
+      <w:r>
+        <w:rPr>
+          <w:rFonts w:ascii="Nirmala UI" w:hAnsi="Nirmala UI" w:eastAsia="Nirmala UI" w:cs="Nirmala UI"/>
+        </w:rPr>
+        <w:t>placing no calls and starting no campaigns:</w:t>
+      </w:r>
+    </w:p>
+    <w:tbl>
+      <w:tblPr>
+        <w:tblStyle w:val="TableGrid"/>
+        <w:tblW w:type="auto" w:w="0"/>
+        <w:jc w:val="center"/>
+        <w:tblLook w:firstColumn="1" w:firstRow="1" w:lastColumn="0" w:lastRow="0" w:noHBand="0" w:noVBand="1" w:val="04A0"/>
+      </w:tblPr>
+      <w:tblGrid>
+        <w:gridCol w:w="2880"/>
+        <w:gridCol w:w="2880"/>
+        <w:gridCol w:w="2880"/>
+      </w:tblGrid>
+      <w:tr>
+        <w:tc>
+          <w:tcPr>
+            <w:tcW w:type="dxa" w:w="2880"/>
+            <w:shd w:val="clear" w:color="auto" w:fill="DCE6F1"/>
+          </w:tcPr>
+          <w:p>
+            <w:pPr>
+              <w:spacing w:before="40" w:after="40"/>
+            </w:pPr>
+            <w:r>
+              <w:rPr>
+                <w:rFonts w:ascii="Nirmala UI" w:hAnsi="Nirmala UI" w:eastAsia="Nirmala UI" w:cs="Nirmala UI"/>
+                <w:b/>
+                <w:sz w:val="18"/>
+              </w:rPr>
+              <w:t>Page</w:t>
+            </w:r>
+          </w:p>
+        </w:tc>
+        <w:tc>
+          <w:tcPr>
+            <w:tcW w:type="dxa" w:w="2880"/>
+            <w:shd w:val="clear" w:color="auto" w:fill="DCE6F1"/>
+          </w:tcPr>
+          <w:p>
+            <w:pPr>
+              <w:spacing w:before="40" w:after="40"/>
+            </w:pPr>
+            <w:r>
+              <w:rPr>
+                <w:rFonts w:ascii="Nirmala UI" w:hAnsi="Nirmala UI" w:eastAsia="Nirmala UI" w:cs="Nirmala UI"/>
+                <w:b/>
+                <w:sz w:val="18"/>
+              </w:rPr>
+              <w:t>Operation</w:t>
+            </w:r>
+          </w:p>
+        </w:tc>
+        <w:tc>
+          <w:tcPr>
+            <w:tcW w:type="dxa" w:w="2880"/>
+            <w:shd w:val="clear" w:color="auto" w:fill="DCE6F1"/>
+          </w:tcPr>
+          <w:p>
+            <w:pPr>
+              <w:spacing w:before="40" w:after="40"/>
+            </w:pPr>
+            <w:r>
+              <w:rPr>
+                <w:rFonts w:ascii="Nirmala UI" w:hAnsi="Nirmala UI" w:eastAsia="Nirmala UI" w:cs="Nirmala UI"/>
+                <w:b/>
+                <w:sz w:val="18"/>
+              </w:rPr>
+              <w:t>Result</w:t>
+            </w:r>
+          </w:p>
+        </w:tc>
+      </w:tr>
+      <w:tr>
+        <w:tc>
+          <w:tcPr>
+            <w:tcW w:type="dxa" w:w="2880"/>
+          </w:tcPr>
+          <w:p>
+            <w:pPr>
+              <w:spacing w:before="40" w:after="40"/>
+            </w:pPr>
+            <w:r>
+              <w:rPr>
+                <w:rFonts w:ascii="Nirmala UI" w:hAnsi="Nirmala UI" w:eastAsia="Nirmala UI" w:cs="Nirmala UI"/>
+                <w:sz w:val="18"/>
+              </w:rPr>
+              <w:t>AI Agent</w:t>
+            </w:r>
+          </w:p>
+        </w:tc>
+        <w:tc>
+          <w:tcPr>
+            <w:tcW w:type="dxa" w:w="2880"/>
+          </w:tcPr>
+          <w:p>
+            <w:pPr>
+              <w:spacing w:before="40" w:after="40"/>
+            </w:pPr>
+            <w:r>
+              <w:rPr>
+                <w:rFonts w:ascii="Nirmala UI" w:hAnsi="Nirmala UI" w:eastAsia="Nirmala UI" w:cs="Nirmala UI"/>
+                <w:sz w:val="18"/>
+              </w:rPr>
+              <w:t>load each of the 4 scripts</w:t>
+            </w:r>
+          </w:p>
+        </w:tc>
+        <w:tc>
+          <w:tcPr>
+            <w:tcW w:type="dxa" w:w="2880"/>
+          </w:tcPr>
+          <w:p>
+            <w:pPr>
+              <w:spacing w:before="40" w:after="40"/>
+            </w:pPr>
+            <w:r>
+              <w:rPr>
+                <w:rFonts w:ascii="Nirmala UI" w:hAnsi="Nirmala UI" w:eastAsia="Nirmala UI" w:cs="Nirmala UI"/>
+                <w:sz w:val="18"/>
+              </w:rPr>
+              <w:t>200, opening line + script both present</w:t>
+            </w:r>
+          </w:p>
+        </w:tc>
+      </w:tr>
+      <w:tr>
+        <w:tc>
+          <w:tcPr>
+            <w:tcW w:type="dxa" w:w="2880"/>
+          </w:tcPr>
+          <w:p>
+            <w:pPr>
+              <w:spacing w:before="40" w:after="40"/>
+            </w:pPr>
+            <w:r>
+              <w:rPr>
+                <w:rFonts w:ascii="Nirmala UI" w:hAnsi="Nirmala UI" w:eastAsia="Nirmala UI" w:cs="Nirmala UI"/>
+                <w:sz w:val="18"/>
+              </w:rPr>
+              <w:t>AI Agent</w:t>
+            </w:r>
+          </w:p>
+        </w:tc>
+        <w:tc>
+          <w:tcPr>
+            <w:tcW w:type="dxa" w:w="2880"/>
+          </w:tcPr>
+          <w:p>
+            <w:pPr>
+              <w:spacing w:before="40" w:after="40"/>
+            </w:pPr>
+            <w:r>
+              <w:rPr>
+                <w:rFonts w:ascii="Nirmala UI" w:hAnsi="Nirmala UI" w:eastAsia="Nirmala UI" w:cs="Nirmala UI"/>
+                <w:sz w:val="18"/>
+              </w:rPr>
+              <w:t>Save &amp; publish</w:t>
+            </w:r>
+          </w:p>
+        </w:tc>
+        <w:tc>
+          <w:tcPr>
+            <w:tcW w:type="dxa" w:w="2880"/>
+          </w:tcPr>
+          <w:p>
+            <w:pPr>
+              <w:spacing w:before="40" w:after="40"/>
+            </w:pPr>
+            <w:r>
+              <w:rPr>
+                <w:rFonts w:ascii="Nirmala UI" w:hAnsi="Nirmala UI" w:eastAsia="Nirmala UI" w:cs="Nirmala UI"/>
+                <w:sz w:val="18"/>
+              </w:rPr>
+              <w:t>version API reachable</w:t>
+            </w:r>
+          </w:p>
+        </w:tc>
+      </w:tr>
+      <w:tr>
+        <w:tc>
+          <w:tcPr>
+            <w:tcW w:type="dxa" w:w="2880"/>
+          </w:tcPr>
+          <w:p>
+            <w:pPr>
+              <w:spacing w:before="40" w:after="40"/>
+            </w:pPr>
+            <w:r>
+              <w:rPr>
+                <w:rFonts w:ascii="Nirmala UI" w:hAnsi="Nirmala UI" w:eastAsia="Nirmala UI" w:cs="Nirmala UI"/>
+                <w:sz w:val="18"/>
+              </w:rPr>
+              <w:t>Campaigns</w:t>
+            </w:r>
+          </w:p>
+        </w:tc>
+        <w:tc>
+          <w:tcPr>
+            <w:tcW w:type="dxa" w:w="2880"/>
+          </w:tcPr>
+          <w:p>
+            <w:pPr>
+              <w:spacing w:before="40" w:after="40"/>
+            </w:pPr>
+            <w:r>
+              <w:rPr>
+                <w:rFonts w:ascii="Nirmala UI" w:hAnsi="Nirmala UI" w:eastAsia="Nirmala UI" w:cs="Nirmala UI"/>
+                <w:sz w:val="18"/>
+              </w:rPr>
+              <w:t>list / read / progress / runs</w:t>
+            </w:r>
+          </w:p>
+        </w:tc>
+        <w:tc>
+          <w:tcPr>
+            <w:tcW w:type="dxa" w:w="2880"/>
+          </w:tcPr>
+          <w:p>
+            <w:pPr>
+              <w:spacing w:before="40" w:after="40"/>
+            </w:pPr>
+            <w:r>
+              <w:rPr>
+                <w:rFonts w:ascii="Nirmala UI" w:hAnsi="Nirmala UI" w:eastAsia="Nirmala UI" w:cs="Nirmala UI"/>
+                <w:sz w:val="18"/>
+              </w:rPr>
+              <w:t>200</w:t>
+            </w:r>
+          </w:p>
+        </w:tc>
+      </w:tr>
+      <w:tr>
+        <w:tc>
+          <w:tcPr>
+            <w:tcW w:type="dxa" w:w="2880"/>
+          </w:tcPr>
+          <w:p>
+            <w:pPr>
+              <w:spacing w:before="40" w:after="40"/>
+            </w:pPr>
+            <w:r>
+              <w:rPr>
+                <w:rFonts w:ascii="Nirmala UI" w:hAnsi="Nirmala UI" w:eastAsia="Nirmala UI" w:cs="Nirmala UI"/>
+                <w:sz w:val="18"/>
+              </w:rPr>
+              <w:t>Campaigns</w:t>
+            </w:r>
+          </w:p>
+        </w:tc>
+        <w:tc>
+          <w:tcPr>
+            <w:tcW w:type="dxa" w:w="2880"/>
+          </w:tcPr>
+          <w:p>
+            <w:pPr>
+              <w:spacing w:before="40" w:after="40"/>
+            </w:pPr>
+            <w:r>
+              <w:rPr>
+                <w:rFonts w:ascii="Nirmala UI" w:hAnsi="Nirmala UI" w:eastAsia="Nirmala UI" w:cs="Nirmala UI"/>
+                <w:sz w:val="18"/>
+              </w:rPr>
+              <w:t>Start / Pause / Resume</w:t>
+            </w:r>
+          </w:p>
+        </w:tc>
+        <w:tc>
+          <w:tcPr>
+            <w:tcW w:type="dxa" w:w="2880"/>
+          </w:tcPr>
+          <w:p>
+            <w:pPr>
+              <w:spacing w:before="40" w:after="40"/>
+            </w:pPr>
+            <w:r>
+              <w:rPr>
+                <w:rFonts w:ascii="Nirmala UI" w:hAnsi="Nirmala UI" w:eastAsia="Nirmala UI" w:cs="Nirmala UI"/>
+                <w:sz w:val="18"/>
+              </w:rPr>
+              <w:t>routes exist</w:t>
+            </w:r>
+          </w:p>
+        </w:tc>
+      </w:tr>
+      <w:tr>
+        <w:tc>
+          <w:tcPr>
+            <w:tcW w:type="dxa" w:w="2880"/>
+          </w:tcPr>
+          <w:p>
+            <w:pPr>
+              <w:spacing w:before="40" w:after="40"/>
+            </w:pPr>
+            <w:r>
+              <w:rPr>
+                <w:rFonts w:ascii="Nirmala UI" w:hAnsi="Nirmala UI" w:eastAsia="Nirmala UI" w:cs="Nirmala UI"/>
+                <w:sz w:val="18"/>
+              </w:rPr>
+              <w:t>Campaigns</w:t>
+            </w:r>
+          </w:p>
+        </w:tc>
+        <w:tc>
+          <w:tcPr>
+            <w:tcW w:type="dxa" w:w="2880"/>
+          </w:tcPr>
+          <w:p>
+            <w:pPr>
+              <w:spacing w:before="40" w:after="40"/>
+            </w:pPr>
+            <w:r>
+              <w:rPr>
+                <w:rFonts w:ascii="Nirmala UI" w:hAnsi="Nirmala UI" w:eastAsia="Nirmala UI" w:cs="Nirmala UI"/>
+                <w:sz w:val="18"/>
+              </w:rPr>
+              <w:t>CSV upload (presigned)</w:t>
+            </w:r>
+          </w:p>
+        </w:tc>
+        <w:tc>
+          <w:tcPr>
+            <w:tcW w:type="dxa" w:w="2880"/>
+          </w:tcPr>
+          <w:p>
+            <w:pPr>
+              <w:spacing w:before="40" w:after="40"/>
+            </w:pPr>
+            <w:r>
+              <w:rPr>
+                <w:rFonts w:ascii="Nirmala UI" w:hAnsi="Nirmala UI" w:eastAsia="Nirmala UI" w:cs="Nirmala UI"/>
+                <w:sz w:val="18"/>
+              </w:rPr>
+              <w:t xml:space="preserve">200, </w:t>
+            </w:r>
+            <w:r>
+              <w:rPr>
+                <w:rFonts w:ascii="Consolas" w:hAnsi="Consolas" w:eastAsia="Consolas" w:cs="Consolas"/>
+                <w:color w:val="A31D1D"/>
+                <w:sz w:val="18"/>
+              </w:rPr>
+              <w:t>vaani-storage.bswealthfinance.com</w:t>
+            </w:r>
+          </w:p>
+        </w:tc>
+      </w:tr>
+      <w:tr>
+        <w:tc>
+          <w:tcPr>
+            <w:tcW w:type="dxa" w:w="2880"/>
+          </w:tcPr>
+          <w:p>
+            <w:pPr>
+              <w:spacing w:before="40" w:after="40"/>
+            </w:pPr>
+            <w:r>
+              <w:rPr>
+                <w:rFonts w:ascii="Nirmala UI" w:hAnsi="Nirmala UI" w:eastAsia="Nirmala UI" w:cs="Nirmala UI"/>
+                <w:sz w:val="18"/>
+              </w:rPr>
+              <w:t>Calls</w:t>
+            </w:r>
+          </w:p>
+        </w:tc>
+        <w:tc>
+          <w:tcPr>
+            <w:tcW w:type="dxa" w:w="2880"/>
+          </w:tcPr>
+          <w:p>
+            <w:pPr>
+              <w:spacing w:before="40" w:after="40"/>
+            </w:pPr>
+            <w:r>
+              <w:rPr>
+                <w:rFonts w:ascii="Nirmala UI" w:hAnsi="Nirmala UI" w:eastAsia="Nirmala UI" w:cs="Nirmala UI"/>
+                <w:sz w:val="18"/>
+              </w:rPr>
+              <w:t>open a call's detail</w:t>
+            </w:r>
+          </w:p>
+        </w:tc>
+        <w:tc>
+          <w:tcPr>
+            <w:tcW w:type="dxa" w:w="2880"/>
+          </w:tcPr>
+          <w:p>
+            <w:pPr>
+              <w:spacing w:before="40" w:after="40"/>
+            </w:pPr>
+            <w:r>
+              <w:rPr>
+                <w:rFonts w:ascii="Nirmala UI" w:hAnsi="Nirmala UI" w:eastAsia="Nirmala UI" w:cs="Nirmala UI"/>
+                <w:sz w:val="18"/>
+              </w:rPr>
+              <w:t>200</w:t>
+            </w:r>
+          </w:p>
+        </w:tc>
+      </w:tr>
+    </w:tbl>
+    <w:p/>
+    <w:p>
+      <w:pPr>
         <w:pStyle w:val="Heading1"/>
       </w:pPr>
       <w:r>

</xml_diff>

<commit_message>
Document the four live test calls and the zero-duration billing bug
Co-Authored-By: Claude Opus 5 (1M context) <noreply@anthropic.com>
</commit_message>
<xml_diff>
--- a/docs/voice-platform/20-admin-dashboard-vaani-cutover-2026-09-03.docx
+++ b/docs/voice-platform/20-admin-dashboard-vaani-cutover-2026-09-03.docx
@@ -4465,6 +4465,1313 @@
           <w:rFonts w:ascii="Nirmala UI" w:hAnsi="Nirmala UI" w:eastAsia="Nirmala UI" w:cs="Nirmala UI"/>
           <w:color w:val="1F4E79"/>
         </w:rPr>
+        <w:t>Four real calls, placed the way the dashboard places them</w:t>
+      </w:r>
+    </w:p>
+    <w:p>
+      <w:pPr>
+        <w:spacing w:after="120"/>
+      </w:pPr>
+      <w:r>
+        <w:rPr>
+          <w:rFonts w:ascii="Nirmala UI" w:hAnsi="Nirmala UI" w:eastAsia="Nirmala UI" w:cs="Nirmala UI"/>
+        </w:rPr>
+        <w:t xml:space="preserve">Run on 2026-09-04 through the exact sequence of </w:t>
+      </w:r>
+      <w:r>
+        <w:rPr>
+          <w:rFonts w:ascii="Consolas" w:hAnsi="Consolas" w:eastAsia="Consolas" w:cs="Consolas"/>
+          <w:color w:val="A31D1D"/>
+          <w:sz w:val="18"/>
+        </w:rPr>
+        <w:t>app/api/calls/single/route.ts</w:t>
+      </w:r>
+    </w:p>
+    <w:p>
+      <w:pPr>
+        <w:spacing w:after="120"/>
+      </w:pPr>
+      <w:r>
+        <w:rPr>
+          <w:rFonts w:ascii="Nirmala UI" w:hAnsi="Nirmala UI" w:eastAsia="Nirmala UI" w:cs="Nirmala UI"/>
+        </w:rPr>
+        <w:t xml:space="preserve">— same lead lookup, credit pre-flight, </w:t>
+      </w:r>
+      <w:r>
+        <w:rPr>
+          <w:rFonts w:ascii="Consolas" w:hAnsi="Consolas" w:eastAsia="Consolas" w:cs="Consolas"/>
+          <w:color w:val="A31D1D"/>
+          <w:sz w:val="18"/>
+        </w:rPr>
+        <w:t>campaign_runs</w:t>
+      </w:r>
+      <w:r>
+        <w:rPr>
+          <w:rFonts w:ascii="Nirmala UI" w:hAnsi="Nirmala UI" w:eastAsia="Nirmala UI" w:cs="Nirmala UI"/>
+        </w:rPr>
+        <w:t xml:space="preserve"> reservation,</w:t>
+      </w:r>
+    </w:p>
+    <w:p>
+      <w:pPr>
+        <w:spacing w:after="120"/>
+      </w:pPr>
+      <w:r>
+        <w:rPr>
+          <w:rFonts w:ascii="Nirmala UI" w:hAnsi="Nirmala UI" w:eastAsia="Nirmala UI" w:cs="Nirmala UI"/>
+        </w:rPr>
+        <w:t xml:space="preserve">compare-and-set claim, one-row CSV, provider campaign with </w:t>
+      </w:r>
+      <w:r>
+        <w:rPr>
+          <w:rFonts w:ascii="Consolas" w:hAnsi="Consolas" w:eastAsia="Consolas" w:cs="Consolas"/>
+          <w:color w:val="A31D1D"/>
+          <w:sz w:val="18"/>
+        </w:rPr>
+        <w:t>max_retries: 0</w:t>
+      </w:r>
+      <w:r>
+        <w:rPr>
+          <w:rFonts w:ascii="Nirmala UI" w:hAnsi="Nirmala UI" w:eastAsia="Nirmala UI" w:cs="Nirmala UI"/>
+        </w:rPr>
+        <w:t>,</w:t>
+      </w:r>
+    </w:p>
+    <w:p>
+      <w:pPr>
+        <w:spacing w:after="120"/>
+      </w:pPr>
+      <w:r>
+        <w:rPr>
+          <w:rFonts w:ascii="Nirmala UI" w:hAnsi="Nirmala UI" w:eastAsia="Nirmala UI" w:cs="Nirmala UI"/>
+        </w:rPr>
+        <w:t>start. Every call to the same test number, one at a time.</w:t>
+      </w:r>
+    </w:p>
+    <w:tbl>
+      <w:tblPr>
+        <w:tblStyle w:val="TableGrid"/>
+        <w:tblW w:type="auto" w:w="0"/>
+        <w:jc w:val="center"/>
+        <w:tblLook w:firstColumn="1" w:firstRow="1" w:lastColumn="0" w:lastRow="0" w:noHBand="0" w:noVBand="1" w:val="04A0"/>
+      </w:tblPr>
+      <w:tblGrid>
+        <w:gridCol w:w="2160"/>
+        <w:gridCol w:w="2160"/>
+        <w:gridCol w:w="2160"/>
+        <w:gridCol w:w="2160"/>
+      </w:tblGrid>
+      <w:tr>
+        <w:tc>
+          <w:tcPr>
+            <w:tcW w:type="dxa" w:w="2160"/>
+            <w:shd w:val="clear" w:color="auto" w:fill="DCE6F1"/>
+          </w:tcPr>
+          <w:p>
+            <w:pPr>
+              <w:spacing w:before="40" w:after="40"/>
+            </w:pPr>
+            <w:r>
+              <w:rPr>
+                <w:rFonts w:ascii="Nirmala UI" w:hAnsi="Nirmala UI" w:eastAsia="Nirmala UI" w:cs="Nirmala UI"/>
+                <w:b/>
+                <w:sz w:val="18"/>
+              </w:rPr>
+              <w:t>agent</w:t>
+            </w:r>
+          </w:p>
+        </w:tc>
+        <w:tc>
+          <w:tcPr>
+            <w:tcW w:type="dxa" w:w="2160"/>
+            <w:shd w:val="clear" w:color="auto" w:fill="DCE6F1"/>
+          </w:tcPr>
+          <w:p>
+            <w:pPr>
+              <w:spacing w:before="40" w:after="40"/>
+            </w:pPr>
+            <w:r>
+              <w:rPr>
+                <w:rFonts w:ascii="Nirmala UI" w:hAnsi="Nirmala UI" w:eastAsia="Nirmala UI" w:cs="Nirmala UI"/>
+                <w:b/>
+                <w:sz w:val="18"/>
+              </w:rPr>
+              <w:t>run</w:t>
+            </w:r>
+          </w:p>
+        </w:tc>
+        <w:tc>
+          <w:tcPr>
+            <w:tcW w:type="dxa" w:w="2160"/>
+            <w:shd w:val="clear" w:color="auto" w:fill="DCE6F1"/>
+          </w:tcPr>
+          <w:p>
+            <w:pPr>
+              <w:spacing w:before="40" w:after="40"/>
+            </w:pPr>
+            <w:r>
+              <w:rPr>
+                <w:rFonts w:ascii="Nirmala UI" w:hAnsi="Nirmala UI" w:eastAsia="Nirmala UI" w:cs="Nirmala UI"/>
+                <w:b/>
+                <w:sz w:val="18"/>
+              </w:rPr>
+              <w:t>result</w:t>
+            </w:r>
+          </w:p>
+        </w:tc>
+        <w:tc>
+          <w:tcPr>
+            <w:tcW w:type="dxa" w:w="2160"/>
+            <w:shd w:val="clear" w:color="auto" w:fill="DCE6F1"/>
+          </w:tcPr>
+          <w:p>
+            <w:pPr>
+              <w:spacing w:before="40" w:after="40"/>
+            </w:pPr>
+            <w:r>
+              <w:rPr>
+                <w:rFonts w:ascii="Nirmala UI" w:hAnsi="Nirmala UI" w:eastAsia="Nirmala UI" w:cs="Nirmala UI"/>
+                <w:b/>
+                <w:sz w:val="18"/>
+              </w:rPr>
+              <w:t>in the dashboard</w:t>
+            </w:r>
+          </w:p>
+        </w:tc>
+      </w:tr>
+      <w:tr>
+        <w:tc>
+          <w:tcPr>
+            <w:tcW w:type="dxa" w:w="2160"/>
+          </w:tcPr>
+          <w:p>
+            <w:pPr>
+              <w:spacing w:before="40" w:after="40"/>
+            </w:pPr>
+            <w:r>
+              <w:rPr>
+                <w:rFonts w:ascii="Nirmala UI" w:hAnsi="Nirmala UI" w:eastAsia="Nirmala UI" w:cs="Nirmala UI"/>
+                <w:sz w:val="18"/>
+              </w:rPr>
+              <w:t>loan (wf3)</w:t>
+            </w:r>
+          </w:p>
+        </w:tc>
+        <w:tc>
+          <w:tcPr>
+            <w:tcW w:type="dxa" w:w="2160"/>
+          </w:tcPr>
+          <w:p>
+            <w:pPr>
+              <w:spacing w:before="40" w:after="40"/>
+            </w:pPr>
+            <w:r>
+              <w:rPr>
+                <w:rFonts w:ascii="Nirmala UI" w:hAnsi="Nirmala UI" w:eastAsia="Nirmala UI" w:cs="Nirmala UI"/>
+                <w:sz w:val="18"/>
+              </w:rPr>
+              <w:t>571</w:t>
+            </w:r>
+          </w:p>
+        </w:tc>
+        <w:tc>
+          <w:tcPr>
+            <w:tcW w:type="dxa" w:w="2160"/>
+          </w:tcPr>
+          <w:p>
+            <w:pPr>
+              <w:spacing w:before="40" w:after="40"/>
+            </w:pPr>
+            <w:r>
+              <w:rPr>
+                <w:rFonts w:ascii="Nirmala UI" w:hAnsi="Nirmala UI" w:eastAsia="Nirmala UI" w:cs="Nirmala UI"/>
+                <w:sz w:val="18"/>
+              </w:rPr>
+              <w:t>answered, 29s</w:t>
+            </w:r>
+          </w:p>
+        </w:tc>
+        <w:tc>
+          <w:tcPr>
+            <w:tcW w:type="dxa" w:w="2160"/>
+          </w:tcPr>
+          <w:p>
+            <w:pPr>
+              <w:spacing w:before="40" w:after="40"/>
+            </w:pPr>
+            <w:r>
+              <w:rPr>
+                <w:rFonts w:ascii="Nirmala UI" w:hAnsi="Nirmala UI" w:eastAsia="Nirmala UI" w:cs="Nirmala UI"/>
+                <w:sz w:val="18"/>
+              </w:rPr>
+              <w:t>logged, lead scored 100</w:t>
+            </w:r>
+          </w:p>
+        </w:tc>
+      </w:tr>
+      <w:tr>
+        <w:tc>
+          <w:tcPr>
+            <w:tcW w:type="dxa" w:w="2160"/>
+          </w:tcPr>
+          <w:p>
+            <w:pPr>
+              <w:spacing w:before="40" w:after="40"/>
+            </w:pPr>
+            <w:r>
+              <w:rPr>
+                <w:rFonts w:ascii="Nirmala UI" w:hAnsi="Nirmala UI" w:eastAsia="Nirmala UI" w:cs="Nirmala UI"/>
+                <w:sz w:val="18"/>
+              </w:rPr>
+              <w:t>solar (wf4)</w:t>
+            </w:r>
+          </w:p>
+        </w:tc>
+        <w:tc>
+          <w:tcPr>
+            <w:tcW w:type="dxa" w:w="2160"/>
+          </w:tcPr>
+          <w:p>
+            <w:pPr>
+              <w:spacing w:before="40" w:after="40"/>
+            </w:pPr>
+            <w:r>
+              <w:rPr>
+                <w:rFonts w:ascii="Nirmala UI" w:hAnsi="Nirmala UI" w:eastAsia="Nirmala UI" w:cs="Nirmala UI"/>
+                <w:sz w:val="18"/>
+              </w:rPr>
+              <w:t>573</w:t>
+            </w:r>
+          </w:p>
+        </w:tc>
+        <w:tc>
+          <w:tcPr>
+            <w:tcW w:type="dxa" w:w="2160"/>
+          </w:tcPr>
+          <w:p>
+            <w:pPr>
+              <w:spacing w:before="40" w:after="40"/>
+            </w:pPr>
+            <w:r>
+              <w:rPr>
+                <w:rFonts w:ascii="Nirmala UI" w:hAnsi="Nirmala UI" w:eastAsia="Nirmala UI" w:cs="Nirmala UI"/>
+                <w:b/>
+                <w:sz w:val="18"/>
+              </w:rPr>
+              <w:t>no answer</w:t>
+            </w:r>
+          </w:p>
+        </w:tc>
+        <w:tc>
+          <w:tcPr>
+            <w:tcW w:type="dxa" w:w="2160"/>
+          </w:tcPr>
+          <w:p>
+            <w:pPr>
+              <w:spacing w:before="40" w:after="40"/>
+            </w:pPr>
+            <w:r>
+              <w:rPr>
+                <w:rFonts w:ascii="Nirmala UI" w:hAnsi="Nirmala UI" w:eastAsia="Nirmala UI" w:cs="Nirmala UI"/>
+                <w:sz w:val="18"/>
+              </w:rPr>
+              <w:t xml:space="preserve">logged as </w:t>
+            </w:r>
+            <w:r>
+              <w:rPr>
+                <w:rFonts w:ascii="Consolas" w:hAnsi="Consolas" w:eastAsia="Consolas" w:cs="Consolas"/>
+                <w:color w:val="A31D1D"/>
+                <w:sz w:val="18"/>
+              </w:rPr>
+              <w:t>no_answer</w:t>
+            </w:r>
+            <w:r>
+              <w:rPr>
+                <w:rFonts w:ascii="Nirmala UI" w:hAnsi="Nirmala UI" w:eastAsia="Nirmala UI" w:cs="Nirmala UI"/>
+                <w:sz w:val="18"/>
+              </w:rPr>
+              <w:t>, lead released</w:t>
+            </w:r>
+          </w:p>
+        </w:tc>
+      </w:tr>
+      <w:tr>
+        <w:tc>
+          <w:tcPr>
+            <w:tcW w:type="dxa" w:w="2160"/>
+          </w:tcPr>
+          <w:p>
+            <w:pPr>
+              <w:spacing w:before="40" w:after="40"/>
+            </w:pPr>
+            <w:r>
+              <w:rPr>
+                <w:rFonts w:ascii="Nirmala UI" w:hAnsi="Nirmala UI" w:eastAsia="Nirmala UI" w:cs="Nirmala UI"/>
+                <w:sz w:val="18"/>
+              </w:rPr>
+              <w:t>investing (wf5)</w:t>
+            </w:r>
+          </w:p>
+        </w:tc>
+        <w:tc>
+          <w:tcPr>
+            <w:tcW w:type="dxa" w:w="2160"/>
+          </w:tcPr>
+          <w:p>
+            <w:pPr>
+              <w:spacing w:before="40" w:after="40"/>
+            </w:pPr>
+            <w:r>
+              <w:rPr>
+                <w:rFonts w:ascii="Nirmala UI" w:hAnsi="Nirmala UI" w:eastAsia="Nirmala UI" w:cs="Nirmala UI"/>
+                <w:sz w:val="18"/>
+              </w:rPr>
+              <w:t>578</w:t>
+            </w:r>
+          </w:p>
+        </w:tc>
+        <w:tc>
+          <w:tcPr>
+            <w:tcW w:type="dxa" w:w="2160"/>
+          </w:tcPr>
+          <w:p>
+            <w:pPr>
+              <w:spacing w:before="40" w:after="40"/>
+            </w:pPr>
+            <w:r>
+              <w:rPr>
+                <w:rFonts w:ascii="Nirmala UI" w:hAnsi="Nirmala UI" w:eastAsia="Nirmala UI" w:cs="Nirmala UI"/>
+                <w:sz w:val="18"/>
+              </w:rPr>
+              <w:t>answered, 98s</w:t>
+            </w:r>
+          </w:p>
+        </w:tc>
+        <w:tc>
+          <w:tcPr>
+            <w:tcW w:type="dxa" w:w="2160"/>
+          </w:tcPr>
+          <w:p>
+            <w:pPr>
+              <w:spacing w:before="40" w:after="40"/>
+            </w:pPr>
+            <w:r>
+              <w:rPr>
+                <w:rFonts w:ascii="Nirmala UI" w:hAnsi="Nirmala UI" w:eastAsia="Nirmala UI" w:cs="Nirmala UI"/>
+                <w:sz w:val="18"/>
+              </w:rPr>
+              <w:t xml:space="preserve">logged, scored 50, </w:t>
+            </w:r>
+            <w:r>
+              <w:rPr>
+                <w:rFonts w:ascii="Nirmala UI" w:hAnsi="Nirmala UI" w:eastAsia="Nirmala UI" w:cs="Nirmala UI"/>
+                <w:b/>
+                <w:sz w:val="18"/>
+              </w:rPr>
+              <w:t>billed 8 credits</w:t>
+            </w:r>
+          </w:p>
+        </w:tc>
+      </w:tr>
+      <w:tr>
+        <w:tc>
+          <w:tcPr>
+            <w:tcW w:type="dxa" w:w="2160"/>
+          </w:tcPr>
+          <w:p>
+            <w:pPr>
+              <w:spacing w:before="40" w:after="40"/>
+            </w:pPr>
+            <w:r>
+              <w:rPr>
+                <w:rFonts w:ascii="Nirmala UI" w:hAnsi="Nirmala UI" w:eastAsia="Nirmala UI" w:cs="Nirmala UI"/>
+                <w:sz w:val="18"/>
+              </w:rPr>
+              <w:t>real estate (wf6)</w:t>
+            </w:r>
+          </w:p>
+        </w:tc>
+        <w:tc>
+          <w:tcPr>
+            <w:tcW w:type="dxa" w:w="2160"/>
+          </w:tcPr>
+          <w:p>
+            <w:pPr>
+              <w:spacing w:before="40" w:after="40"/>
+            </w:pPr>
+            <w:r>
+              <w:rPr>
+                <w:rFonts w:ascii="Nirmala UI" w:hAnsi="Nirmala UI" w:eastAsia="Nirmala UI" w:cs="Nirmala UI"/>
+                <w:sz w:val="18"/>
+              </w:rPr>
+              <w:t>579</w:t>
+            </w:r>
+          </w:p>
+        </w:tc>
+        <w:tc>
+          <w:tcPr>
+            <w:tcW w:type="dxa" w:w="2160"/>
+          </w:tcPr>
+          <w:p>
+            <w:pPr>
+              <w:spacing w:before="40" w:after="40"/>
+            </w:pPr>
+            <w:r>
+              <w:rPr>
+                <w:rFonts w:ascii="Nirmala UI" w:hAnsi="Nirmala UI" w:eastAsia="Nirmala UI" w:cs="Nirmala UI"/>
+                <w:sz w:val="18"/>
+              </w:rPr>
+              <w:t>answered, 114s</w:t>
+            </w:r>
+          </w:p>
+        </w:tc>
+        <w:tc>
+          <w:tcPr>
+            <w:tcW w:type="dxa" w:w="2160"/>
+          </w:tcPr>
+          <w:p>
+            <w:pPr>
+              <w:spacing w:before="40" w:after="40"/>
+            </w:pPr>
+            <w:r>
+              <w:rPr>
+                <w:rFonts w:ascii="Nirmala UI" w:hAnsi="Nirmala UI" w:eastAsia="Nirmala UI" w:cs="Nirmala UI"/>
+                <w:sz w:val="18"/>
+              </w:rPr>
+              <w:t xml:space="preserve">logged, scored 100, </w:t>
+            </w:r>
+            <w:r>
+              <w:rPr>
+                <w:rFonts w:ascii="Nirmala UI" w:hAnsi="Nirmala UI" w:eastAsia="Nirmala UI" w:cs="Nirmala UI"/>
+                <w:b/>
+                <w:sz w:val="18"/>
+              </w:rPr>
+              <w:t>billed 8 credits</w:t>
+            </w:r>
+          </w:p>
+        </w:tc>
+      </w:tr>
+    </w:tbl>
+    <w:p/>
+    <w:p>
+      <w:pPr>
+        <w:spacing w:after="120"/>
+      </w:pPr>
+      <w:r>
+        <w:rPr>
+          <w:rFonts w:ascii="Nirmala UI" w:hAnsi="Nirmala UI" w:eastAsia="Nirmala UI" w:cs="Nirmala UI"/>
+        </w:rPr>
+        <w:t>Twelve links confirmed on each answered call: run row → Vaani campaign → run →</w:t>
+      </w:r>
+    </w:p>
+    <w:p>
+      <w:pPr>
+        <w:spacing w:after="120"/>
+      </w:pPr>
+      <w:r>
+        <w:rPr>
+          <w:rFonts w:ascii="Nirmala UI" w:hAnsi="Nirmala UI" w:eastAsia="Nirmala UI" w:cs="Nirmala UI"/>
+        </w:rPr>
+        <w:t xml:space="preserve">recording and transcript → </w:t>
+      </w:r>
+      <w:r>
+        <w:rPr>
+          <w:rFonts w:ascii="Consolas" w:hAnsi="Consolas" w:eastAsia="Consolas" w:cs="Consolas"/>
+          <w:color w:val="A31D1D"/>
+          <w:sz w:val="18"/>
+        </w:rPr>
+        <w:t>call_logs</w:t>
+      </w:r>
+      <w:r>
+        <w:rPr>
+          <w:rFonts w:ascii="Nirmala UI" w:hAnsi="Nirmala UI" w:eastAsia="Nirmala UI" w:cs="Nirmala UI"/>
+        </w:rPr>
+        <w:t xml:space="preserve"> row → </w:t>
+      </w:r>
+      <w:r>
+        <w:rPr>
+          <w:rFonts w:ascii="Consolas" w:hAnsi="Consolas" w:eastAsia="Consolas" w:cs="Consolas"/>
+          <w:color w:val="A31D1D"/>
+          <w:sz w:val="18"/>
+        </w:rPr>
+        <w:t>provider</w:t>
+      </w:r>
+      <w:r>
+        <w:rPr>
+          <w:rFonts w:ascii="Nirmala UI" w:hAnsi="Nirmala UI" w:eastAsia="Nirmala UI" w:cs="Nirmala UI"/>
+        </w:rPr>
+        <w:t xml:space="preserve"> stamped → media URLs</w:t>
+      </w:r>
+    </w:p>
+    <w:p>
+      <w:pPr>
+        <w:spacing w:after="120"/>
+      </w:pPr>
+      <w:r>
+        <w:rPr>
+          <w:rFonts w:ascii="Nirmala UI" w:hAnsi="Nirmala UI" w:eastAsia="Nirmala UI" w:cs="Nirmala UI"/>
+        </w:rPr>
+        <w:t>stored → outcome and duration → lead updated → metered → provider stamped in</w:t>
+      </w:r>
+    </w:p>
+    <w:p>
+      <w:pPr>
+        <w:spacing w:after="120"/>
+      </w:pPr>
+      <w:r>
+        <w:rPr>
+          <w:rFonts w:ascii="Nirmala UI" w:hAnsi="Nirmala UI" w:eastAsia="Nirmala UI" w:cs="Nirmala UI"/>
+        </w:rPr>
+        <w:t>billing → ledger debited.</w:t>
+      </w:r>
+    </w:p>
+    <w:p>
+      <w:pPr>
+        <w:spacing w:after="120"/>
+      </w:pPr>
+      <w:r>
+        <w:rPr>
+          <w:rFonts w:ascii="Nirmala UI" w:hAnsi="Nirmala UI" w:eastAsia="Nirmala UI" w:cs="Nirmala UI"/>
+        </w:rPr>
+        <w:t xml:space="preserve">The no-answer is worth its own line: it correctly produced </w:t>
+      </w:r>
+      <w:r>
+        <w:rPr>
+          <w:rFonts w:ascii="Nirmala UI" w:hAnsi="Nirmala UI" w:eastAsia="Nirmala UI" w:cs="Nirmala UI"/>
+          <w:b/>
+        </w:rPr>
+        <w:t>no</w:t>
+      </w:r>
+      <w:r>
+        <w:rPr>
+          <w:rFonts w:ascii="Nirmala UI" w:hAnsi="Nirmala UI" w:eastAsia="Nirmala UI" w:cs="Nirmala UI"/>
+        </w:rPr>
+        <w:t xml:space="preserve"> recording URL.</w:t>
+      </w:r>
+    </w:p>
+    <w:p>
+      <w:pPr>
+        <w:spacing w:after="120"/>
+      </w:pPr>
+      <w:r>
+        <w:rPr>
+          <w:rFonts w:ascii="Nirmala UI" w:hAnsi="Nirmala UI" w:eastAsia="Nirmala UI" w:cs="Nirmala UI"/>
+        </w:rPr>
+        <w:t xml:space="preserve">A call that never connects has no recording file, while </w:t>
+      </w:r>
+      <w:r>
+        <w:rPr>
+          <w:rFonts w:ascii="Consolas" w:hAnsi="Consolas" w:eastAsia="Consolas" w:cs="Consolas"/>
+          <w:color w:val="A31D1D"/>
+          <w:sz w:val="18"/>
+        </w:rPr>
+        <w:t>recording_public_url</w:t>
+      </w:r>
+    </w:p>
+    <w:p>
+      <w:pPr>
+        <w:spacing w:after="120"/>
+      </w:pPr>
+      <w:r>
+        <w:rPr>
+          <w:rFonts w:ascii="Nirmala UI" w:hAnsi="Nirmala UI" w:eastAsia="Nirmala UI" w:cs="Nirmala UI"/>
+        </w:rPr>
+        <w:t>is built from the access token regardless and would 404. Storing nothing is the</w:t>
+      </w:r>
+    </w:p>
+    <w:p>
+      <w:pPr>
+        <w:spacing w:after="120"/>
+      </w:pPr>
+      <w:r>
+        <w:rPr>
+          <w:rFonts w:ascii="Nirmala UI" w:hAnsi="Nirmala UI" w:eastAsia="Nirmala UI" w:cs="Nirmala UI"/>
+        </w:rPr>
+        <w:t>right answer, and the sweep does.</w:t>
+      </w:r>
+    </w:p>
+    <w:p>
+      <w:pPr>
+        <w:pStyle w:val="Heading2"/>
+      </w:pPr>
+      <w:r>
+        <w:rPr>
+          <w:rFonts w:ascii="Nirmala UI" w:hAnsi="Nirmala UI" w:eastAsia="Nirmala UI" w:cs="Nirmala UI"/>
+          <w:color w:val="1F4E79"/>
+        </w:rPr>
+        <w:t>The first call exposed a money bug</w:t>
+      </w:r>
+    </w:p>
+    <w:p>
+      <w:pPr>
+        <w:spacing w:after="120"/>
+      </w:pPr>
+      <w:r>
+        <w:rPr>
+          <w:rFonts w:ascii="Nirmala UI" w:hAnsi="Nirmala UI" w:eastAsia="Nirmala UI" w:cs="Nirmala UI"/>
+        </w:rPr>
+        <w:t>Run 571 is why placing a real call mattered.</w:t>
+      </w:r>
+    </w:p>
+    <w:p>
+      <w:pPr>
+        <w:spacing w:after="0" w:before="0"/>
+        <w:ind w:left="360"/>
+        <w:shd w:val="clear" w:color="auto" w:fill="F2F2F2"/>
+      </w:pPr>
+      <w:r>
+        <w:rPr>
+          <w:rFonts w:ascii="Consolas" w:hAnsi="Consolas" w:eastAsia="Consolas" w:cs="Consolas"/>
+          <w:sz w:val="16"/>
+        </w:rPr>
+        <w:t>12:59:40  the call connects</w:t>
+      </w:r>
+    </w:p>
+    <w:p>
+      <w:pPr>
+        <w:spacing w:after="0" w:before="0"/>
+        <w:ind w:left="360"/>
+        <w:shd w:val="clear" w:color="auto" w:fill="F2F2F2"/>
+      </w:pPr>
+      <w:r>
+        <w:rPr>
+          <w:rFonts w:ascii="Consolas" w:hAnsi="Consolas" w:eastAsia="Consolas" w:cs="Consolas"/>
+          <w:sz w:val="16"/>
+        </w:rPr>
+        <w:t>13:00:09  it ends — 29 seconds of talk time</w:t>
+      </w:r>
+    </w:p>
+    <w:p>
+      <w:pPr>
+        <w:spacing w:after="0" w:before="0"/>
+        <w:ind w:left="360"/>
+        <w:shd w:val="clear" w:color="auto" w:fill="F2F2F2"/>
+      </w:pPr>
+      <w:r>
+        <w:rPr>
+          <w:rFonts w:ascii="Consolas" w:hAnsi="Consolas" w:eastAsia="Consolas" w:cs="Consolas"/>
+          <w:sz w:val="16"/>
+        </w:rPr>
+        <w:t>13:00:10  the ten-minute billing sweep reads it while it is still in flight</w:t>
+      </w:r>
+    </w:p>
+    <w:p>
+      <w:pPr>
+        <w:spacing w:after="0" w:before="0"/>
+        <w:ind w:left="360"/>
+        <w:shd w:val="clear" w:color="auto" w:fill="F2F2F2"/>
+      </w:pPr>
+      <w:r>
+        <w:rPr>
+          <w:rFonts w:ascii="Consolas" w:hAnsi="Consolas" w:eastAsia="Consolas" w:cs="Consolas"/>
+          <w:sz w:val="16"/>
+        </w:rPr>
+        <w:t xml:space="preserve">          and writes duration_seconds 0, outcome 'unknown'</w:t>
+      </w:r>
+    </w:p>
+    <w:p/>
+    <w:p>
+      <w:pPr>
+        <w:spacing w:after="120"/>
+      </w:pPr>
+      <w:r>
+        <w:rPr>
+          <w:rFonts w:ascii="Consolas" w:hAnsi="Consolas" w:eastAsia="Consolas" w:cs="Consolas"/>
+          <w:color w:val="A31D1D"/>
+          <w:sz w:val="18"/>
+        </w:rPr>
+        <w:t>call_usage</w:t>
+      </w:r>
+      <w:r>
+        <w:rPr>
+          <w:rFonts w:ascii="Nirmala UI" w:hAnsi="Nirmala UI" w:eastAsia="Nirmala UI" w:cs="Nirmala UI"/>
+        </w:rPr>
+        <w:t xml:space="preserve"> rows are insert-if-absent, so that first write is what the client</w:t>
+      </w:r>
+    </w:p>
+    <w:p>
+      <w:pPr>
+        <w:spacing w:after="120"/>
+      </w:pPr>
+      <w:r>
+        <w:rPr>
+          <w:rFonts w:ascii="Nirmala UI" w:hAnsi="Nirmala UI" w:eastAsia="Nirmala UI" w:cs="Nirmala UI"/>
+        </w:rPr>
+        <w:t xml:space="preserve">is charged on for ever. </w:t>
+      </w:r>
+      <w:r>
+        <w:rPr>
+          <w:rFonts w:ascii="Consolas" w:hAnsi="Consolas" w:eastAsia="Consolas" w:cs="Consolas"/>
+          <w:color w:val="A31D1D"/>
+          <w:sz w:val="18"/>
+        </w:rPr>
+        <w:t>postDebit</w:t>
+      </w:r>
+      <w:r>
+        <w:rPr>
+          <w:rFonts w:ascii="Nirmala UI" w:hAnsi="Nirmala UI" w:eastAsia="Nirmala UI" w:cs="Nirmala UI"/>
+        </w:rPr>
+        <w:t xml:space="preserve"> found zero talk time, stamped </w:t>
+      </w:r>
+      <w:r>
+        <w:rPr>
+          <w:rFonts w:ascii="Consolas" w:hAnsi="Consolas" w:eastAsia="Consolas" w:cs="Consolas"/>
+          <w:color w:val="A31D1D"/>
+          <w:sz w:val="18"/>
+        </w:rPr>
+        <w:t>billed_at</w:t>
+      </w:r>
+      <w:r>
+        <w:rPr>
+          <w:rFonts w:ascii="Nirmala UI" w:hAnsi="Nirmala UI" w:eastAsia="Nirmala UI" w:cs="Nirmala UI"/>
+        </w:rPr>
+        <w:t xml:space="preserve"> to</w:t>
+      </w:r>
+    </w:p>
+    <w:p>
+      <w:pPr>
+        <w:spacing w:after="120"/>
+      </w:pPr>
+      <w:r>
+        <w:rPr>
+          <w:rFonts w:ascii="Nirmala UI" w:hAnsi="Nirmala UI" w:eastAsia="Nirmala UI" w:cs="Nirmala UI"/>
+        </w:rPr>
+        <w:t xml:space="preserve">stop reconsidering it, and a real conversation was settled at </w:t>
+      </w:r>
+      <w:r>
+        <w:rPr>
+          <w:rFonts w:ascii="Nirmala UI" w:hAnsi="Nirmala UI" w:eastAsia="Nirmala UI" w:cs="Nirmala UI"/>
+          <w:b/>
+        </w:rPr>
+        <w:t>zero</w:t>
+      </w:r>
+      <w:r>
+        <w:rPr>
+          <w:rFonts w:ascii="Nirmala UI" w:hAnsi="Nirmala UI" w:eastAsia="Nirmala UI" w:cs="Nirmala UI"/>
+        </w:rPr>
+        <w:t>. It</w:t>
+      </w:r>
+    </w:p>
+    <w:p>
+      <w:pPr>
+        <w:spacing w:after="120"/>
+      </w:pPr>
+      <w:r>
+        <w:rPr>
+          <w:rFonts w:ascii="Nirmala UI" w:hAnsi="Nirmala UI" w:eastAsia="Nirmala UI" w:cs="Nirmala UI"/>
+        </w:rPr>
+        <w:t>cannot self-correct: every later sweep sees the row and skips it.</w:t>
+      </w:r>
+    </w:p>
+    <w:p>
+      <w:pPr>
+        <w:spacing w:after="120"/>
+      </w:pPr>
+      <w:r>
+        <w:rPr>
+          <w:rFonts w:ascii="Consolas" w:hAnsi="Consolas" w:eastAsia="Consolas" w:cs="Consolas"/>
+          <w:color w:val="A31D1D"/>
+          <w:sz w:val="18"/>
+        </w:rPr>
+        <w:t>meterSingleRun</w:t>
+      </w:r>
+      <w:r>
+        <w:rPr>
+          <w:rFonts w:ascii="Nirmala UI" w:hAnsi="Nirmala UI" w:eastAsia="Nirmala UI" w:cs="Nirmala UI"/>
+        </w:rPr>
+        <w:t xml:space="preserve"> already refused exactly this case and its comment spells out</w:t>
+      </w:r>
+    </w:p>
+    <w:p>
+      <w:pPr>
+        <w:spacing w:after="120"/>
+      </w:pPr>
+      <w:r>
+        <w:rPr>
+          <w:rFonts w:ascii="Nirmala UI" w:hAnsi="Nirmala UI" w:eastAsia="Nirmala UI" w:cs="Nirmala UI"/>
+        </w:rPr>
+        <w:t xml:space="preserve">the damage. </w:t>
+      </w:r>
+      <w:r>
+        <w:rPr>
+          <w:rFonts w:ascii="Consolas" w:hAnsi="Consolas" w:eastAsia="Consolas" w:cs="Consolas"/>
+          <w:color w:val="A31D1D"/>
+          <w:sz w:val="18"/>
+        </w:rPr>
+        <w:t>meterCampaign</w:t>
+      </w:r>
+      <w:r>
+        <w:rPr>
+          <w:rFonts w:ascii="Nirmala UI" w:hAnsi="Nirmala UI" w:eastAsia="Nirmala UI" w:cs="Nirmala UI"/>
+        </w:rPr>
+        <w:t xml:space="preserve"> — the cron path that meters everything — never got</w:t>
+      </w:r>
+    </w:p>
+    <w:p>
+      <w:pPr>
+        <w:spacing w:after="120"/>
+      </w:pPr>
+      <w:r>
+        <w:rPr>
+          <w:rFonts w:ascii="Nirmala UI" w:hAnsi="Nirmala UI" w:eastAsia="Nirmala UI" w:cs="Nirmala UI"/>
+        </w:rPr>
+        <w:t xml:space="preserve">the same guard. </w:t>
+      </w:r>
+      <w:r>
+        <w:rPr>
+          <w:rFonts w:ascii="Consolas" w:hAnsi="Consolas" w:eastAsia="Consolas" w:cs="Consolas"/>
+          <w:color w:val="A31D1D"/>
+          <w:sz w:val="18"/>
+        </w:rPr>
+        <w:t>isMeterable()</w:t>
+      </w:r>
+      <w:r>
+        <w:rPr>
+          <w:rFonts w:ascii="Nirmala UI" w:hAnsi="Nirmala UI" w:eastAsia="Nirmala UI" w:cs="Nirmala UI"/>
+        </w:rPr>
+        <w:t xml:space="preserve"> now gates it. </w:t>
+      </w:r>
+      <w:r>
+        <w:rPr>
+          <w:rFonts w:ascii="Consolas" w:hAnsi="Consolas" w:eastAsia="Consolas" w:cs="Consolas"/>
+          <w:color w:val="A31D1D"/>
+          <w:sz w:val="18"/>
+        </w:rPr>
+        <w:t>is_completed</w:t>
+      </w:r>
+      <w:r>
+        <w:rPr>
+          <w:rFonts w:ascii="Nirmala UI" w:hAnsi="Nirmala UI" w:eastAsia="Nirmala UI" w:cs="Nirmala UI"/>
+        </w:rPr>
+        <w:t xml:space="preserve"> is the test rather</w:t>
+      </w:r>
+    </w:p>
+    <w:p>
+      <w:pPr>
+        <w:spacing w:after="120"/>
+      </w:pPr>
+      <w:r>
+        <w:rPr>
+          <w:rFonts w:ascii="Nirmala UI" w:hAnsi="Nirmala UI" w:eastAsia="Nirmala UI" w:cs="Nirmala UI"/>
+        </w:rPr>
+        <w:t xml:space="preserve">than </w:t>
+      </w:r>
+      <w:r>
+        <w:rPr>
+          <w:rFonts w:ascii="Consolas" w:hAnsi="Consolas" w:eastAsia="Consolas" w:cs="Consolas"/>
+          <w:color w:val="A31D1D"/>
+          <w:sz w:val="18"/>
+        </w:rPr>
+        <w:t>duration &gt; 0</w:t>
+      </w:r>
+      <w:r>
+        <w:rPr>
+          <w:rFonts w:ascii="Nirmala UI" w:hAnsi="Nirmala UI" w:eastAsia="Nirmala UI" w:cs="Nirmala UI"/>
+        </w:rPr>
+        <w:t xml:space="preserve">, because a </w:t>
+      </w:r>
+      <w:r>
+        <w:rPr>
+          <w:rFonts w:ascii="Nirmala UI" w:hAnsi="Nirmala UI" w:eastAsia="Nirmala UI" w:cs="Nirmala UI"/>
+          <w:i/>
+        </w:rPr>
+        <w:t>finished</w:t>
+      </w:r>
+      <w:r>
+        <w:rPr>
+          <w:rFonts w:ascii="Nirmala UI" w:hAnsi="Nirmala UI" w:eastAsia="Nirmala UI" w:cs="Nirmala UI"/>
+        </w:rPr>
+        <w:t xml:space="preserve"> call with no talk time is a genuine</w:t>
+      </w:r>
+    </w:p>
+    <w:p>
+      <w:pPr>
+        <w:spacing w:after="120"/>
+      </w:pPr>
+      <w:r>
+        <w:rPr>
+          <w:rFonts w:ascii="Nirmala UI" w:hAnsi="Nirmala UI" w:eastAsia="Nirmala UI" w:cs="Nirmala UI"/>
+        </w:rPr>
+        <w:t>no-answer that must be recorded once as unbillable.</w:t>
+      </w:r>
+    </w:p>
+    <w:p>
+      <w:pPr>
+        <w:spacing w:after="120"/>
+      </w:pPr>
+      <w:r>
+        <w:rPr>
+          <w:rFonts w:ascii="Nirmala UI" w:hAnsi="Nirmala UI" w:eastAsia="Nirmala UI" w:cs="Nirmala UI"/>
+        </w:rPr>
+        <w:t xml:space="preserve">The same premature write reached </w:t>
+      </w:r>
+      <w:r>
+        <w:rPr>
+          <w:rFonts w:ascii="Consolas" w:hAnsi="Consolas" w:eastAsia="Consolas" w:cs="Consolas"/>
+          <w:color w:val="A31D1D"/>
+          <w:sz w:val="18"/>
+        </w:rPr>
+        <w:t>call_logs</w:t>
+      </w:r>
+      <w:r>
+        <w:rPr>
+          <w:rFonts w:ascii="Nirmala UI" w:hAnsi="Nirmala UI" w:eastAsia="Nirmala UI" w:cs="Nirmala UI"/>
+        </w:rPr>
+        <w:t xml:space="preserve"> too, via the webhook at hang-up:</w:t>
+      </w:r>
+    </w:p>
+    <w:p>
+      <w:pPr>
+        <w:spacing w:after="120"/>
+      </w:pPr>
+      <w:r>
+        <w:rPr>
+          <w:rFonts w:ascii="Nirmala UI" w:hAnsi="Nirmala UI" w:eastAsia="Nirmala UI" w:cs="Nirmala UI"/>
+        </w:rPr>
+        <w:t xml:space="preserve">that 29-second call was stored as </w:t>
+      </w:r>
+      <w:r>
+        <w:rPr>
+          <w:rFonts w:ascii="Consolas" w:hAnsi="Consolas" w:eastAsia="Consolas" w:cs="Consolas"/>
+          <w:color w:val="A31D1D"/>
+          <w:sz w:val="18"/>
+        </w:rPr>
+        <w:t>duration: 0</w:t>
+      </w:r>
+      <w:r>
+        <w:rPr>
+          <w:rFonts w:ascii="Nirmala UI" w:hAnsi="Nirmala UI" w:eastAsia="Nirmala UI" w:cs="Nirmala UI"/>
+        </w:rPr>
+        <w:t xml:space="preserve"> with no recording, and</w:t>
+      </w:r>
+    </w:p>
+    <w:p>
+      <w:pPr>
+        <w:spacing w:after="120"/>
+      </w:pPr>
+      <w:r>
+        <w:rPr>
+          <w:rFonts w:ascii="Consolas" w:hAnsi="Consolas" w:eastAsia="Consolas" w:cs="Consolas"/>
+          <w:color w:val="A31D1D"/>
+          <w:sz w:val="18"/>
+        </w:rPr>
+        <w:t>applyRunResult</w:t>
+      </w:r>
+      <w:r>
+        <w:rPr>
+          <w:rFonts w:ascii="Nirmala UI" w:hAnsi="Nirmala UI" w:eastAsia="Nirmala UI" w:cs="Nirmala UI"/>
+        </w:rPr>
+        <w:t xml:space="preserve"> returned </w:t>
+      </w:r>
+      <w:r>
+        <w:rPr>
+          <w:rFonts w:ascii="Consolas" w:hAnsi="Consolas" w:eastAsia="Consolas" w:cs="Consolas"/>
+          <w:color w:val="A31D1D"/>
+          <w:sz w:val="18"/>
+        </w:rPr>
+        <w:t>'duplicate'</w:t>
+      </w:r>
+      <w:r>
+        <w:rPr>
+          <w:rFonts w:ascii="Nirmala UI" w:hAnsi="Nirmala UI" w:eastAsia="Nirmala UI" w:cs="Nirmala UI"/>
+        </w:rPr>
+        <w:t xml:space="preserve"> without looking. </w:t>
+      </w:r>
+      <w:r>
+        <w:rPr>
+          <w:rFonts w:ascii="Consolas" w:hAnsi="Consolas" w:eastAsia="Consolas" w:cs="Consolas"/>
+          <w:color w:val="A31D1D"/>
+          <w:sz w:val="18"/>
+        </w:rPr>
+        <w:t>backfillIncompleteLog</w:t>
+      </w:r>
+    </w:p>
+    <w:p>
+      <w:pPr>
+        <w:spacing w:after="120"/>
+      </w:pPr>
+      <w:r>
+        <w:rPr>
+          <w:rFonts w:ascii="Nirmala UI" w:hAnsi="Nirmala UI" w:eastAsia="Nirmala UI" w:cs="Nirmala UI"/>
+        </w:rPr>
+        <w:t>now repairs a zero duration and missing media from the authoritative run —</w:t>
+      </w:r>
+    </w:p>
+    <w:p>
+      <w:pPr>
+        <w:spacing w:after="120"/>
+      </w:pPr>
+      <w:r>
+        <w:rPr>
+          <w:rFonts w:ascii="Nirmala UI" w:hAnsi="Nirmala UI" w:eastAsia="Nirmala UI" w:cs="Nirmala UI"/>
+        </w:rPr>
+        <w:t>facts only. Score, qualification, lead status, retry_count and notes are left</w:t>
+      </w:r>
+    </w:p>
+    <w:p>
+      <w:pPr>
+        <w:spacing w:after="120"/>
+      </w:pPr>
+      <w:r>
+        <w:rPr>
+          <w:rFonts w:ascii="Nirmala UI" w:hAnsi="Nirmala UI" w:eastAsia="Nirmala UI" w:cs="Nirmala UI"/>
+        </w:rPr>
+        <w:t>alone, because re-applying those on every tick is the runaway migration 006 had</w:t>
+      </w:r>
+    </w:p>
+    <w:p>
+      <w:pPr>
+        <w:spacing w:after="120"/>
+      </w:pPr>
+      <w:r>
+        <w:rPr>
+          <w:rFonts w:ascii="Nirmala UI" w:hAnsi="Nirmala UI" w:eastAsia="Nirmala UI" w:cs="Nirmala UI"/>
+        </w:rPr>
+        <w:t>to clean up after.</w:t>
+      </w:r>
+    </w:p>
+    <w:p>
+      <w:pPr>
+        <w:spacing w:after="120"/>
+      </w:pPr>
+      <w:r>
+        <w:rPr>
+          <w:rFonts w:ascii="Nirmala UI" w:hAnsi="Nirmala UI" w:eastAsia="Nirmala UI" w:cs="Nirmala UI"/>
+        </w:rPr>
+        <w:t>Proof it works: run 578, a 98-second call, metered at 98 seconds and billed 8</w:t>
+      </w:r>
+    </w:p>
+    <w:p>
+      <w:pPr>
+        <w:spacing w:after="120"/>
+      </w:pPr>
+      <w:r>
+        <w:rPr>
+          <w:rFonts w:ascii="Nirmala UI" w:hAnsi="Nirmala UI" w:eastAsia="Nirmala UI" w:cs="Nirmala UI"/>
+        </w:rPr>
+        <w:t>credits (two minutes, rounded up). Balance 40,000 → 32,000 → 24,000 milli across</w:t>
+      </w:r>
+    </w:p>
+    <w:p>
+      <w:pPr>
+        <w:spacing w:after="120"/>
+      </w:pPr>
+      <w:r>
+        <w:rPr>
+          <w:rFonts w:ascii="Nirmala UI" w:hAnsi="Nirmala UI" w:eastAsia="Nirmala UI" w:cs="Nirmala UI"/>
+        </w:rPr>
+        <w:t>the two answered calls.</w:t>
+      </w:r>
+    </w:p>
+    <w:p>
+      <w:pPr>
+        <w:pStyle w:val="Heading1"/>
+      </w:pPr>
+      <w:r>
+        <w:rPr>
+          <w:rFonts w:ascii="Nirmala UI" w:hAnsi="Nirmala UI" w:eastAsia="Nirmala UI" w:cs="Nirmala UI"/>
+          <w:color w:val="1F4E79"/>
+        </w:rPr>
+        <w:t>Two agent defects found on the real-estate call — NOT fixed</w:t>
+      </w:r>
+    </w:p>
+    <w:p>
+      <w:pPr>
+        <w:spacing w:after="120"/>
+      </w:pPr>
+      <w:r>
+        <w:rPr>
+          <w:rFonts w:ascii="Nirmala UI" w:hAnsi="Nirmala UI" w:eastAsia="Nirmala UI" w:cs="Nirmala UI"/>
+        </w:rPr>
+        <w:t>Both are in the agent's behaviour, not the plumbing, and are left alone by</w:t>
+      </w:r>
+    </w:p>
+    <w:p>
+      <w:pPr>
+        <w:spacing w:after="120"/>
+      </w:pPr>
+      <w:r>
+        <w:rPr>
+          <w:rFonts w:ascii="Nirmala UI" w:hAnsi="Nirmala UI" w:eastAsia="Nirmala UI" w:cs="Nirmala UI"/>
+        </w:rPr>
+        <w:t>instruction. They are real and reproducible on run 579's transcript.</w:t>
+      </w:r>
+    </w:p>
+    <w:p>
+      <w:pPr>
+        <w:spacing w:after="120"/>
+      </w:pPr>
+      <w:r>
+        <w:rPr>
+          <w:rFonts w:ascii="Nirmala UI" w:hAnsi="Nirmala UI" w:eastAsia="Nirmala UI" w:cs="Nirmala UI"/>
+          <w:b/>
+        </w:rPr>
+        <w:t>It re-asks what it has already been told.</w:t>
+      </w:r>
+      <w:r>
+        <w:rPr>
+          <w:rFonts w:ascii="Nirmala UI" w:hAnsi="Nirmala UI" w:eastAsia="Nirmala UI" w:cs="Nirmala UI"/>
+        </w:rPr>
+        <w:t xml:space="preserve"> The caller gave the location at</w:t>
+      </w:r>
+    </w:p>
+    <w:p>
+      <w:pPr>
+        <w:spacing w:after="120"/>
+      </w:pPr>
+      <w:r>
+        <w:rPr>
+          <w:rFonts w:ascii="Nirmala UI" w:hAnsi="Nirmala UI" w:eastAsia="Nirmala UI" w:cs="Nirmala UI"/>
+        </w:rPr>
+        <w:t>13:37:04 and the timeline at 13:37:19. At 13:37:21 it asked for the location</w:t>
+      </w:r>
+    </w:p>
+    <w:p>
+      <w:pPr>
+        <w:spacing w:after="120"/>
+      </w:pPr>
+      <w:r>
+        <w:rPr>
+          <w:rFonts w:ascii="Nirmala UI" w:hAnsi="Nirmala UI" w:eastAsia="Nirmala UI" w:cs="Nirmala UI"/>
+        </w:rPr>
+        <w:t>again, and at 13:37:26 for the property type again. The caller's last words on</w:t>
+      </w:r>
+    </w:p>
+    <w:p>
+      <w:pPr>
+        <w:spacing w:after="120"/>
+      </w:pPr>
+      <w:r>
+        <w:rPr>
+          <w:rFonts w:ascii="Nirmala UI" w:hAnsi="Nirmala UI" w:eastAsia="Nirmala UI" w:cs="Nirmala UI"/>
+        </w:rPr>
+        <w:t>the call were:</w:t>
+      </w:r>
+    </w:p>
+    <w:p>
+      <w:pPr>
+        <w:spacing w:before="120" w:after="120"/>
+        <w:ind w:left="432"/>
+      </w:pPr>
+      <w:r>
+        <w:rPr>
+          <w:rFonts w:ascii="Nirmala UI" w:hAnsi="Nirmala UI" w:eastAsia="Nirmala UI" w:cs="Nirmala UI"/>
+          <w:i/>
+          <w:color w:val="5A5A5A"/>
+        </w:rPr>
+        <w:t xml:space="preserve">ఎన్ని సార్లు చెప్పాలి మీకు ఆన్సర్ లో ఒకసారి గుర్తుపెట్టుకోరా </w:t>
+      </w:r>
+      <w:r>
+        <w:rPr>
+          <w:rFonts w:ascii="Nirmala UI" w:hAnsi="Nirmala UI" w:eastAsia="Nirmala UI" w:cs="Nirmala UI"/>
+          <w:i/>
+          <w:color w:val="5A5A5A"/>
+        </w:rPr>
+        <w:t>(How many times must I tell you? Can't you remember an answer once?)</w:t>
+      </w:r>
+    </w:p>
+    <w:p>
+      <w:pPr>
+        <w:spacing w:after="120"/>
+      </w:pPr>
+      <w:r>
+        <w:rPr>
+          <w:rFonts w:ascii="Nirmala UI" w:hAnsi="Nirmala UI" w:eastAsia="Nirmala UI" w:cs="Nirmala UI"/>
+        </w:rPr>
+        <w:t>The extraction still came out complete and correct — plot, Andhra Pradesh,</w:t>
+      </w:r>
+    </w:p>
+    <w:p>
+      <w:pPr>
+        <w:spacing w:after="120"/>
+      </w:pPr>
+      <w:r>
+        <w:rPr>
+          <w:rFonts w:ascii="Nirmala UI" w:hAnsi="Nirmala UI" w:eastAsia="Nirmala UI" w:cs="Nirmala UI"/>
+        </w:rPr>
+        <w:t>50–60 crore, day after tomorrow, score 100 — so this costs goodwill rather than</w:t>
+      </w:r>
+    </w:p>
+    <w:p>
+      <w:pPr>
+        <w:spacing w:after="120"/>
+      </w:pPr>
+      <w:r>
+        <w:rPr>
+          <w:rFonts w:ascii="Nirmala UI" w:hAnsi="Nirmala UI" w:eastAsia="Nirmala UI" w:cs="Nirmala UI"/>
+        </w:rPr>
+        <w:t>data.</w:t>
+      </w:r>
+    </w:p>
+    <w:p>
+      <w:pPr>
+        <w:spacing w:after="120"/>
+      </w:pPr>
+      <w:r>
+        <w:rPr>
+          <w:rFonts w:ascii="Nirmala UI" w:hAnsi="Nirmala UI" w:eastAsia="Nirmala UI" w:cs="Nirmala UI"/>
+          <w:b/>
+        </w:rPr>
+        <w:t>It read its own workflow name aloud.</w:t>
+      </w:r>
+      <w:r>
+        <w:rPr>
+          <w:rFonts w:ascii="Nirmala UI" w:hAnsi="Nirmala UI" w:eastAsia="Nirmala UI" w:cs="Nirmala UI"/>
+        </w:rPr>
+        <w:t xml:space="preserve"> Asked "who are you?", it answered:</w:t>
+      </w:r>
+    </w:p>
+    <w:p>
+      <w:pPr>
+        <w:spacing w:before="120" w:after="120"/>
+        <w:ind w:left="432"/>
+      </w:pPr>
+      <w:r>
+        <w:rPr>
+          <w:rFonts w:ascii="Nirmala UI" w:hAnsi="Nirmala UI" w:eastAsia="Nirmala UI" w:cs="Nirmala UI"/>
+          <w:i/>
+          <w:color w:val="5A5A5A"/>
+        </w:rPr>
+        <w:t xml:space="preserve">నేను ప్రియ, </w:t>
+      </w:r>
+      <w:r>
+        <w:rPr>
+          <w:rFonts w:ascii="Nirmala UI" w:hAnsi="Nirmala UI" w:eastAsia="Nirmala UI" w:cs="Nirmala UI"/>
+          <w:b/>
+          <w:i/>
+          <w:color w:val="5A5A5A"/>
+        </w:rPr>
+        <w:t>BS Wealth Finance Property — qualification</w:t>
+      </w:r>
+      <w:r>
+        <w:rPr>
+          <w:rFonts w:ascii="Nirmala UI" w:hAnsi="Nirmala UI" w:eastAsia="Nirmala UI" w:cs="Nirmala UI"/>
+          <w:i/>
+          <w:color w:val="5A5A5A"/>
+        </w:rPr>
+        <w:t xml:space="preserve"> నుంచి మాట్లాడుతున్నాను</w:t>
+      </w:r>
+    </w:p>
+    <w:p>
+      <w:pPr>
+        <w:spacing w:after="120"/>
+      </w:pPr>
+      <w:r>
+        <w:rPr>
+          <w:rFonts w:ascii="Nirmala UI" w:hAnsi="Nirmala UI" w:eastAsia="Nirmala UI" w:cs="Nirmala UI"/>
+        </w:rPr>
+        <w:t>"— qualification" is the internal workflow name, not a company.</w:t>
+      </w:r>
+    </w:p>
+    <w:p>
+      <w:pPr>
+        <w:pStyle w:val="Heading1"/>
+      </w:pPr>
+      <w:r>
+        <w:rPr>
+          <w:rFonts w:ascii="Nirmala UI" w:hAnsi="Nirmala UI" w:eastAsia="Nirmala UI" w:cs="Nirmala UI"/>
+          <w:color w:val="1F4E79"/>
+        </w:rPr>
         <w:t>What is still outstanding</w:t>
       </w:r>
     </w:p>

</xml_diff>

<commit_message>
Document the empty-call-log bug, the fix, and the collision it exposed
Co-Authored-By: Claude Opus 5 (1M context) <noreply@anthropic.com>
</commit_message>
<xml_diff>
--- a/docs/voice-platform/20-admin-dashboard-vaani-cutover-2026-09-03.docx
+++ b/docs/voice-platform/20-admin-dashboard-vaani-cutover-2026-09-03.docx
@@ -6796,6 +6796,1851 @@
           <w:rFonts w:ascii="Nirmala UI" w:hAnsi="Nirmala UI" w:eastAsia="Nirmala UI" w:cs="Nirmala UI"/>
         </w:rPr>
         <w:t>someone was editing these workflows the same afternoon.</w:t>
+      </w:r>
+    </w:p>
+    <w:p>
+      <w:pPr>
+        <w:pStyle w:val="Heading1"/>
+      </w:pPr>
+      <w:r>
+        <w:rPr>
+          <w:rFonts w:ascii="Nirmala UI" w:hAnsi="Nirmala UI" w:eastAsia="Nirmala UI" w:cs="Nirmala UI"/>
+          <w:color w:val="1F4E79"/>
+        </w:rPr>
+        <w:t>A finished call could land empty and stay empty (06 Sep)</w:t>
+      </w:r>
+    </w:p>
+    <w:p>
+      <w:pPr>
+        <w:spacing w:after="120"/>
+      </w:pPr>
+      <w:r>
+        <w:rPr>
+          <w:rFonts w:ascii="Nirmala UI" w:hAnsi="Nirmala UI" w:eastAsia="Nirmala UI" w:cs="Nirmala UI"/>
+        </w:rPr>
+        <w:t>Reported as "call ended 5 minutes ago and the call log still is not updated".</w:t>
+      </w:r>
+    </w:p>
+    <w:p>
+      <w:pPr>
+        <w:spacing w:after="120"/>
+      </w:pPr>
+      <w:r>
+        <w:rPr>
+          <w:rFonts w:ascii="Nirmala UI" w:hAnsi="Nirmala UI" w:eastAsia="Nirmala UI" w:cs="Nirmala UI"/>
+        </w:rPr>
+        <w:t>My earlier "the chain works" was based on four calls I placed myself, which was</w:t>
+      </w:r>
+    </w:p>
+    <w:p>
+      <w:pPr>
+        <w:spacing w:after="120"/>
+      </w:pPr>
+      <w:r>
+        <w:rPr>
+          <w:rFonts w:ascii="Nirmala UI" w:hAnsi="Nirmala UI" w:eastAsia="Nirmala UI" w:cs="Nirmala UI"/>
+        </w:rPr>
+        <w:t>not proof — this is a race, and it spoils some calls and not others.</w:t>
+      </w:r>
+    </w:p>
+    <w:p>
+      <w:pPr>
+        <w:spacing w:after="120"/>
+      </w:pPr>
+      <w:r>
+        <w:rPr>
+          <w:rFonts w:ascii="Nirmala UI" w:hAnsi="Nirmala UI" w:eastAsia="Nirmala UI" w:cs="Nirmala UI"/>
+          <w:b/>
+        </w:rPr>
+        <w:t>Run 798, solar, 08:49:48 UTC</w:t>
+      </w:r>
+    </w:p>
+    <w:tbl>
+      <w:tblPr>
+        <w:tblStyle w:val="TableGrid"/>
+        <w:tblW w:type="auto" w:w="0"/>
+        <w:jc w:val="center"/>
+        <w:tblLook w:firstColumn="1" w:firstRow="1" w:lastColumn="0" w:lastRow="0" w:noHBand="0" w:noVBand="1" w:val="04A0"/>
+      </w:tblPr>
+      <w:tblGrid>
+        <w:gridCol w:w="2880"/>
+        <w:gridCol w:w="2880"/>
+        <w:gridCol w:w="2880"/>
+      </w:tblGrid>
+      <w:tr>
+        <w:tc>
+          <w:tcPr>
+            <w:tcW w:type="dxa" w:w="2880"/>
+            <w:shd w:val="clear" w:color="auto" w:fill="DCE6F1"/>
+          </w:tcPr>
+          <w:p>
+            <w:pPr>
+              <w:spacing w:before="40" w:after="40"/>
+            </w:pPr>
+          </w:p>
+        </w:tc>
+        <w:tc>
+          <w:tcPr>
+            <w:tcW w:type="dxa" w:w="2880"/>
+            <w:shd w:val="clear" w:color="auto" w:fill="DCE6F1"/>
+          </w:tcPr>
+          <w:p>
+            <w:pPr>
+              <w:spacing w:before="40" w:after="40"/>
+            </w:pPr>
+            <w:r>
+              <w:rPr>
+                <w:rFonts w:ascii="Nirmala UI" w:hAnsi="Nirmala UI" w:eastAsia="Nirmala UI" w:cs="Nirmala UI"/>
+                <w:b/>
+                <w:sz w:val="18"/>
+              </w:rPr>
+              <w:t>Vaani</w:t>
+            </w:r>
+          </w:p>
+        </w:tc>
+        <w:tc>
+          <w:tcPr>
+            <w:tcW w:type="dxa" w:w="2880"/>
+            <w:shd w:val="clear" w:color="auto" w:fill="DCE6F1"/>
+          </w:tcPr>
+          <w:p>
+            <w:pPr>
+              <w:spacing w:before="40" w:after="40"/>
+            </w:pPr>
+            <w:r>
+              <w:rPr>
+                <w:rFonts w:ascii="Nirmala UI" w:hAnsi="Nirmala UI" w:eastAsia="Nirmala UI" w:cs="Nirmala UI"/>
+                <w:b/>
+                <w:sz w:val="18"/>
+              </w:rPr>
+              <w:t>Dashboard, before</w:t>
+            </w:r>
+          </w:p>
+        </w:tc>
+      </w:tr>
+      <w:tr>
+        <w:tc>
+          <w:tcPr>
+            <w:tcW w:type="dxa" w:w="2880"/>
+          </w:tcPr>
+          <w:p>
+            <w:pPr>
+              <w:spacing w:before="40" w:after="40"/>
+            </w:pPr>
+            <w:r>
+              <w:rPr>
+                <w:rFonts w:ascii="Nirmala UI" w:hAnsi="Nirmala UI" w:eastAsia="Nirmala UI" w:cs="Nirmala UI"/>
+                <w:sz w:val="18"/>
+              </w:rPr>
+              <w:t>duration</w:t>
+            </w:r>
+          </w:p>
+        </w:tc>
+        <w:tc>
+          <w:tcPr>
+            <w:tcW w:type="dxa" w:w="2880"/>
+          </w:tcPr>
+          <w:p>
+            <w:pPr>
+              <w:spacing w:before="40" w:after="40"/>
+            </w:pPr>
+            <w:r>
+              <w:rPr>
+                <w:rFonts w:ascii="Nirmala UI" w:hAnsi="Nirmala UI" w:eastAsia="Nirmala UI" w:cs="Nirmala UI"/>
+                <w:sz w:val="18"/>
+              </w:rPr>
+              <w:t>70s</w:t>
+            </w:r>
+          </w:p>
+        </w:tc>
+        <w:tc>
+          <w:tcPr>
+            <w:tcW w:type="dxa" w:w="2880"/>
+          </w:tcPr>
+          <w:p>
+            <w:pPr>
+              <w:spacing w:before="40" w:after="40"/>
+            </w:pPr>
+            <w:r>
+              <w:rPr>
+                <w:rFonts w:ascii="Nirmala UI" w:hAnsi="Nirmala UI" w:eastAsia="Nirmala UI" w:cs="Nirmala UI"/>
+                <w:b/>
+                <w:sz w:val="18"/>
+              </w:rPr>
+              <w:t>0</w:t>
+            </w:r>
+          </w:p>
+        </w:tc>
+      </w:tr>
+      <w:tr>
+        <w:tc>
+          <w:tcPr>
+            <w:tcW w:type="dxa" w:w="2880"/>
+          </w:tcPr>
+          <w:p>
+            <w:pPr>
+              <w:spacing w:before="40" w:after="40"/>
+            </w:pPr>
+            <w:r>
+              <w:rPr>
+                <w:rFonts w:ascii="Nirmala UI" w:hAnsi="Nirmala UI" w:eastAsia="Nirmala UI" w:cs="Nirmala UI"/>
+                <w:sz w:val="18"/>
+              </w:rPr>
+              <w:t>recording / transcript</w:t>
+            </w:r>
+          </w:p>
+        </w:tc>
+        <w:tc>
+          <w:tcPr>
+            <w:tcW w:type="dxa" w:w="2880"/>
+          </w:tcPr>
+          <w:p>
+            <w:pPr>
+              <w:spacing w:before="40" w:after="40"/>
+            </w:pPr>
+            <w:r>
+              <w:rPr>
+                <w:rFonts w:ascii="Nirmala UI" w:hAnsi="Nirmala UI" w:eastAsia="Nirmala UI" w:cs="Nirmala UI"/>
+                <w:sz w:val="18"/>
+              </w:rPr>
+              <w:t>present</w:t>
+            </w:r>
+          </w:p>
+        </w:tc>
+        <w:tc>
+          <w:tcPr>
+            <w:tcW w:type="dxa" w:w="2880"/>
+          </w:tcPr>
+          <w:p>
+            <w:pPr>
+              <w:spacing w:before="40" w:after="40"/>
+            </w:pPr>
+            <w:r>
+              <w:rPr>
+                <w:rFonts w:ascii="Nirmala UI" w:hAnsi="Nirmala UI" w:eastAsia="Nirmala UI" w:cs="Nirmala UI"/>
+                <w:sz w:val="18"/>
+              </w:rPr>
+              <w:t>none</w:t>
+            </w:r>
+          </w:p>
+        </w:tc>
+      </w:tr>
+      <w:tr>
+        <w:tc>
+          <w:tcPr>
+            <w:tcW w:type="dxa" w:w="2880"/>
+          </w:tcPr>
+          <w:p>
+            <w:pPr>
+              <w:spacing w:before="40" w:after="40"/>
+            </w:pPr>
+            <w:r>
+              <w:rPr>
+                <w:rFonts w:ascii="Nirmala UI" w:hAnsi="Nirmala UI" w:eastAsia="Nirmala UI" w:cs="Nirmala UI"/>
+                <w:sz w:val="18"/>
+              </w:rPr>
+              <w:t>house_ownership</w:t>
+            </w:r>
+          </w:p>
+        </w:tc>
+        <w:tc>
+          <w:tcPr>
+            <w:tcW w:type="dxa" w:w="2880"/>
+          </w:tcPr>
+          <w:p>
+            <w:pPr>
+              <w:spacing w:before="40" w:after="40"/>
+            </w:pPr>
+            <w:r>
+              <w:rPr>
+                <w:rFonts w:ascii="Consolas" w:hAnsi="Consolas" w:eastAsia="Consolas" w:cs="Consolas"/>
+                <w:color w:val="A31D1D"/>
+                <w:sz w:val="18"/>
+              </w:rPr>
+              <w:t>own</w:t>
+            </w:r>
+          </w:p>
+        </w:tc>
+        <w:tc>
+          <w:tcPr>
+            <w:tcW w:type="dxa" w:w="2880"/>
+          </w:tcPr>
+          <w:p>
+            <w:pPr>
+              <w:spacing w:before="40" w:after="40"/>
+            </w:pPr>
+            <w:r>
+              <w:rPr>
+                <w:rFonts w:ascii="Nirmala UI" w:hAnsi="Nirmala UI" w:eastAsia="Nirmala UI" w:cs="Nirmala UI"/>
+                <w:sz w:val="18"/>
+              </w:rPr>
+              <w:t>—</w:t>
+            </w:r>
+          </w:p>
+        </w:tc>
+      </w:tr>
+      <w:tr>
+        <w:tc>
+          <w:tcPr>
+            <w:tcW w:type="dxa" w:w="2880"/>
+          </w:tcPr>
+          <w:p>
+            <w:pPr>
+              <w:spacing w:before="40" w:after="40"/>
+            </w:pPr>
+            <w:r>
+              <w:rPr>
+                <w:rFonts w:ascii="Nirmala UI" w:hAnsi="Nirmala UI" w:eastAsia="Nirmala UI" w:cs="Nirmala UI"/>
+                <w:sz w:val="18"/>
+              </w:rPr>
+              <w:t>solar_planning</w:t>
+            </w:r>
+          </w:p>
+        </w:tc>
+        <w:tc>
+          <w:tcPr>
+            <w:tcW w:type="dxa" w:w="2880"/>
+          </w:tcPr>
+          <w:p>
+            <w:pPr>
+              <w:spacing w:before="40" w:after="40"/>
+            </w:pPr>
+            <w:r>
+              <w:rPr>
+                <w:rFonts w:ascii="Consolas" w:hAnsi="Consolas" w:eastAsia="Consolas" w:cs="Consolas"/>
+                <w:color w:val="A31D1D"/>
+                <w:sz w:val="18"/>
+              </w:rPr>
+              <w:t>true</w:t>
+            </w:r>
+          </w:p>
+        </w:tc>
+        <w:tc>
+          <w:tcPr>
+            <w:tcW w:type="dxa" w:w="2880"/>
+          </w:tcPr>
+          <w:p>
+            <w:pPr>
+              <w:spacing w:before="40" w:after="40"/>
+            </w:pPr>
+            <w:r>
+              <w:rPr>
+                <w:rFonts w:ascii="Nirmala UI" w:hAnsi="Nirmala UI" w:eastAsia="Nirmala UI" w:cs="Nirmala UI"/>
+                <w:sz w:val="18"/>
+              </w:rPr>
+              <w:t>—</w:t>
+            </w:r>
+          </w:p>
+        </w:tc>
+      </w:tr>
+      <w:tr>
+        <w:tc>
+          <w:tcPr>
+            <w:tcW w:type="dxa" w:w="2880"/>
+          </w:tcPr>
+          <w:p>
+            <w:pPr>
+              <w:spacing w:before="40" w:after="40"/>
+            </w:pPr>
+            <w:r>
+              <w:rPr>
+                <w:rFonts w:ascii="Nirmala UI" w:hAnsi="Nirmala UI" w:eastAsia="Nirmala UI" w:cs="Nirmala UI"/>
+                <w:sz w:val="18"/>
+              </w:rPr>
+              <w:t>lead score</w:t>
+            </w:r>
+          </w:p>
+        </w:tc>
+        <w:tc>
+          <w:tcPr>
+            <w:tcW w:type="dxa" w:w="2880"/>
+          </w:tcPr>
+          <w:p>
+            <w:pPr>
+              <w:spacing w:before="40" w:after="40"/>
+            </w:pPr>
+            <w:r>
+              <w:rPr>
+                <w:rFonts w:ascii="Nirmala UI" w:hAnsi="Nirmala UI" w:eastAsia="Nirmala UI" w:cs="Nirmala UI"/>
+                <w:sz w:val="18"/>
+              </w:rPr>
+              <w:t>100</w:t>
+            </w:r>
+          </w:p>
+        </w:tc>
+        <w:tc>
+          <w:tcPr>
+            <w:tcW w:type="dxa" w:w="2880"/>
+          </w:tcPr>
+          <w:p>
+            <w:pPr>
+              <w:spacing w:before="40" w:after="40"/>
+            </w:pPr>
+            <w:r>
+              <w:rPr>
+                <w:rFonts w:ascii="Nirmala UI" w:hAnsi="Nirmala UI" w:eastAsia="Nirmala UI" w:cs="Nirmala UI"/>
+                <w:b/>
+                <w:sz w:val="18"/>
+              </w:rPr>
+              <w:t>0</w:t>
+            </w:r>
+          </w:p>
+        </w:tc>
+      </w:tr>
+    </w:tbl>
+    <w:p/>
+    <w:p>
+      <w:pPr>
+        <w:spacing w:after="120"/>
+      </w:pPr>
+      <w:r>
+        <w:rPr>
+          <w:rFonts w:ascii="Nirmala UI" w:hAnsi="Nirmala UI" w:eastAsia="Nirmala UI" w:cs="Nirmala UI"/>
+        </w:rPr>
+        <w:t>A qualified customer shown to the client as a dud. Three things had to be true</w:t>
+      </w:r>
+    </w:p>
+    <w:p>
+      <w:pPr>
+        <w:spacing w:after="120"/>
+      </w:pPr>
+      <w:r>
+        <w:rPr>
+          <w:rFonts w:ascii="Nirmala UI" w:hAnsi="Nirmala UI" w:eastAsia="Nirmala UI" w:cs="Nirmala UI"/>
+        </w:rPr>
+        <w:t>at once, and all three were:</w:t>
+      </w:r>
+    </w:p>
+    <w:p>
+      <w:pPr>
+        <w:pStyle w:val="ListNumber"/>
+      </w:pPr>
+      <w:r>
+        <w:rPr>
+          <w:rFonts w:ascii="Nirmala UI" w:hAnsi="Nirmala UI" w:eastAsia="Nirmala UI" w:cs="Nirmala UI"/>
+          <w:b/>
+        </w:rPr>
+        <w:t>The webhook wins a race against extraction.</w:t>
+      </w:r>
+      <w:r>
+        <w:rPr>
+          <w:rFonts w:ascii="Nirmala UI" w:hAnsi="Nirmala UI" w:eastAsia="Nirmala UI" w:cs="Nirmala UI"/>
+        </w:rPr>
+        <w:t xml:space="preserve"> Vaani's webhook node fires at</w:t>
+      </w:r>
+    </w:p>
+    <w:p>
+      <w:pPr>
+        <w:spacing w:after="120"/>
+      </w:pPr>
+      <w:r>
+        <w:rPr>
+          <w:rFonts w:ascii="Nirmala UI" w:hAnsi="Nirmala UI" w:eastAsia="Nirmala UI" w:cs="Nirmala UI"/>
+        </w:rPr>
+        <w:t xml:space="preserve">hang-up; when </w:t>
+      </w:r>
+      <w:r>
+        <w:rPr>
+          <w:rFonts w:ascii="Consolas" w:hAnsi="Consolas" w:eastAsia="Consolas" w:cs="Consolas"/>
+          <w:color w:val="A31D1D"/>
+          <w:sz w:val="18"/>
+        </w:rPr>
+        <w:t>perform_final_variable_extraction</w:t>
+      </w:r>
+      <w:r>
+        <w:rPr>
+          <w:rFonts w:ascii="Nirmala UI" w:hAnsi="Nirmala UI" w:eastAsia="Nirmala UI" w:cs="Nirmala UI"/>
+        </w:rPr>
+        <w:t xml:space="preserve"> has not finished, every</w:t>
+      </w:r>
+    </w:p>
+    <w:p>
+      <w:pPr>
+        <w:spacing w:after="120"/>
+      </w:pPr>
+      <w:r>
+        <w:rPr>
+          <w:rFonts w:ascii="Consolas" w:hAnsi="Consolas" w:eastAsia="Consolas" w:cs="Consolas"/>
+          <w:color w:val="A31D1D"/>
+          <w:sz w:val="18"/>
+        </w:rPr>
+        <w:t>{{gathered_context.X}}</w:t>
+      </w:r>
+      <w:r>
+        <w:rPr>
+          <w:rFonts w:ascii="Nirmala UI" w:hAnsi="Nirmala UI" w:eastAsia="Nirmala UI" w:cs="Nirmala UI"/>
+        </w:rPr>
+        <w:t xml:space="preserve"> renders empty and the duration renders 0 — and that</w:t>
+      </w:r>
+    </w:p>
+    <w:p>
+      <w:pPr>
+        <w:spacing w:after="120"/>
+      </w:pPr>
+      <w:r>
+        <w:rPr>
+          <w:rFonts w:ascii="Nirmala UI" w:hAnsi="Nirmala UI" w:eastAsia="Nirmala UI" w:cs="Nirmala UI"/>
+        </w:rPr>
+        <w:t>was stored as the record. Of six real calls that day, three arrived complete.</w:t>
+      </w:r>
+    </w:p>
+    <w:p>
+      <w:pPr>
+        <w:pStyle w:val="ListNumber"/>
+      </w:pPr>
+      <w:r>
+        <w:rPr>
+          <w:rFonts w:ascii="Nirmala UI" w:hAnsi="Nirmala UI" w:eastAsia="Nirmala UI" w:cs="Nirmala UI"/>
+          <w:b/>
+        </w:rPr>
+        <w:t>Nothing completed the row.</w:t>
+      </w:r>
+      <w:r>
+        <w:rPr>
+          <w:rFonts w:ascii="Nirmala UI" w:hAnsi="Nirmala UI" w:eastAsia="Nirmala UI" w:cs="Nirmala UI"/>
+        </w:rPr>
+        <w:t xml:space="preserve"> The 04 Sep backfill repaired only duration and</w:t>
+      </w:r>
+    </w:p>
+    <w:p>
+      <w:pPr>
+        <w:spacing w:after="120"/>
+      </w:pPr>
+      <w:r>
+        <w:rPr>
+          <w:rFonts w:ascii="Nirmala UI" w:hAnsi="Nirmala UI" w:eastAsia="Nirmala UI" w:cs="Nirmala UI"/>
+        </w:rPr>
+        <w:t>media; I had left scoring alone to avoid the 006 re-scoring runaway, so the</w:t>
+      </w:r>
+    </w:p>
+    <w:p>
+      <w:pPr>
+        <w:spacing w:after="120"/>
+      </w:pPr>
+      <w:r>
+        <w:rPr>
+          <w:rFonts w:ascii="Nirmala UI" w:hAnsi="Nirmala UI" w:eastAsia="Nirmala UI" w:cs="Nirmala UI"/>
+        </w:rPr>
+        <w:t>answers never arrived.</w:t>
+      </w:r>
+    </w:p>
+    <w:p>
+      <w:pPr>
+        <w:pStyle w:val="ListNumber"/>
+      </w:pPr>
+      <w:r>
+        <w:rPr>
+          <w:rFonts w:ascii="Nirmala UI" w:hAnsi="Nirmala UI" w:eastAsia="Nirmala UI" w:cs="Nirmala UI"/>
+          <w:b/>
+        </w:rPr>
+        <w:t>The repair could not have run anyway.</w:t>
+      </w:r>
+      <w:r>
+        <w:rPr>
+          <w:rFonts w:ascii="Nirmala UI" w:hAnsi="Nirmala UI" w:eastAsia="Nirmala UI" w:cs="Nirmala UI"/>
+        </w:rPr>
+        <w:t xml:space="preserve"> The cron's campaign loop only visits</w:t>
+      </w:r>
+    </w:p>
+    <w:p>
+      <w:pPr>
+        <w:spacing w:after="120"/>
+      </w:pPr>
+      <w:r>
+        <w:rPr>
+          <w:rFonts w:ascii="Consolas" w:hAnsi="Consolas" w:eastAsia="Consolas" w:cs="Consolas"/>
+          <w:color w:val="A31D1D"/>
+          <w:sz w:val="18"/>
+        </w:rPr>
+        <w:t>queued/running/paused</w:t>
+      </w:r>
+      <w:r>
+        <w:rPr>
+          <w:rFonts w:ascii="Nirmala UI" w:hAnsi="Nirmala UI" w:eastAsia="Nirmala UI" w:cs="Nirmala UI"/>
+        </w:rPr>
+        <w:t xml:space="preserve"> campaigns — </w:t>
+      </w:r>
+      <w:r>
+        <w:rPr>
+          <w:rFonts w:ascii="Nirmala UI" w:hAnsi="Nirmala UI" w:eastAsia="Nirmala UI" w:cs="Nirmala UI"/>
+          <w:b/>
+        </w:rPr>
+        <w:t>101 of 113 were `completed`</w:t>
+      </w:r>
+      <w:r>
+        <w:rPr>
+          <w:rFonts w:ascii="Nirmala UI" w:hAnsi="Nirmala UI" w:eastAsia="Nirmala UI" w:cs="Nirmala UI"/>
+        </w:rPr>
+        <w:t>, and a</w:t>
+      </w:r>
+    </w:p>
+    <w:p>
+      <w:pPr>
+        <w:spacing w:after="120"/>
+      </w:pPr>
+      <w:r>
+        <w:rPr>
+          <w:rFonts w:ascii="Nirmala UI" w:hAnsi="Nirmala UI" w:eastAsia="Nirmala UI" w:cs="Nirmala UI"/>
+        </w:rPr>
+        <w:t>completed campaign is never revisited.</w:t>
+      </w:r>
+    </w:p>
+    <w:p>
+      <w:pPr>
+        <w:pStyle w:val="Heading2"/>
+      </w:pPr>
+      <w:r>
+        <w:rPr>
+          <w:rFonts w:ascii="Nirmala UI" w:hAnsi="Nirmala UI" w:eastAsia="Nirmala UI" w:cs="Nirmala UI"/>
+          <w:color w:val="1F4E79"/>
+        </w:rPr>
+        <w:t>The fix, at all three points</w:t>
+      </w:r>
+    </w:p>
+    <w:p>
+      <w:pPr>
+        <w:pStyle w:val="ListBullet"/>
+      </w:pPr>
+      <w:r>
+        <w:rPr>
+          <w:rFonts w:ascii="Nirmala UI" w:hAnsi="Nirmala UI" w:eastAsia="Nirmala UI" w:cs="Nirmala UI"/>
+        </w:rPr>
+        <w:t xml:space="preserve">The </w:t>
+      </w:r>
+      <w:r>
+        <w:rPr>
+          <w:rFonts w:ascii="Nirmala UI" w:hAnsi="Nirmala UI" w:eastAsia="Nirmala UI" w:cs="Nirmala UI"/>
+          <w:b/>
+        </w:rPr>
+        <w:t>webhook</w:t>
+      </w:r>
+      <w:r>
+        <w:rPr>
+          <w:rFonts w:ascii="Nirmala UI" w:hAnsi="Nirmala UI" w:eastAsia="Nirmala UI" w:cs="Nirmala UI"/>
+        </w:rPr>
+        <w:t xml:space="preserve"> now reads the run back from Vaani when the payload carries no</w:t>
+      </w:r>
+    </w:p>
+    <w:p>
+      <w:pPr>
+        <w:spacing w:after="120"/>
+      </w:pPr>
+      <w:r>
+        <w:rPr>
+          <w:rFonts w:ascii="Nirmala UI" w:hAnsi="Nirmala UI" w:eastAsia="Nirmala UI" w:cs="Nirmala UI"/>
+        </w:rPr>
+        <w:t>duration or no qualification, and merges it before the insert. The row is right</w:t>
+      </w:r>
+    </w:p>
+    <w:p>
+      <w:pPr>
+        <w:spacing w:after="120"/>
+      </w:pPr>
+      <w:r>
+        <w:rPr>
+          <w:rFonts w:ascii="Nirmala UI" w:hAnsi="Nirmala UI" w:eastAsia="Nirmala UI" w:cs="Nirmala UI"/>
+        </w:rPr>
+        <w:t>within seconds rather than waiting for a sweep. Best-effort: a failed fetch</w:t>
+      </w:r>
+    </w:p>
+    <w:p>
+      <w:pPr>
+        <w:spacing w:after="120"/>
+      </w:pPr>
+      <w:r>
+        <w:rPr>
+          <w:rFonts w:ascii="Nirmala UI" w:hAnsi="Nirmala UI" w:eastAsia="Nirmala UI" w:cs="Nirmala UI"/>
+        </w:rPr>
+        <w:t>still stores the thin row, because a thin record beats none.</w:t>
+      </w:r>
+    </w:p>
+    <w:p>
+      <w:pPr>
+        <w:pStyle w:val="ListBullet"/>
+      </w:pPr>
+      <w:r>
+        <w:rPr>
+          <w:rFonts w:ascii="Nirmala UI" w:hAnsi="Nirmala UI" w:eastAsia="Nirmala UI" w:cs="Nirmala UI"/>
+          <w:b/>
+        </w:rPr>
+        <w:t>`backfillIncompleteLog`</w:t>
+      </w:r>
+      <w:r>
+        <w:rPr>
+          <w:rFonts w:ascii="Nirmala UI" w:hAnsi="Nirmala UI" w:eastAsia="Nirmala UI" w:cs="Nirmala UI"/>
+        </w:rPr>
+        <w:t xml:space="preserve"> completes the qualification too, but at most once —</w:t>
+      </w:r>
+    </w:p>
+    <w:p>
+      <w:pPr>
+        <w:spacing w:after="120"/>
+      </w:pPr>
+      <w:r>
+        <w:rPr>
+          <w:rFonts w:ascii="Nirmala UI" w:hAnsi="Nirmala UI" w:eastAsia="Nirmala UI" w:cs="Nirmala UI"/>
+        </w:rPr>
+        <w:t>the guard is "stored row has none AND the run has one", so it closes for ever</w:t>
+      </w:r>
+    </w:p>
+    <w:p>
+      <w:pPr>
+        <w:spacing w:after="120"/>
+      </w:pPr>
+      <w:r>
+        <w:rPr>
+          <w:rFonts w:ascii="Nirmala UI" w:hAnsi="Nirmala UI" w:eastAsia="Nirmala UI" w:cs="Nirmala UI"/>
+        </w:rPr>
+        <w:t xml:space="preserve">after it fires. </w:t>
+      </w:r>
+      <w:r>
+        <w:rPr>
+          <w:rFonts w:ascii="Consolas" w:hAnsi="Consolas" w:eastAsia="Consolas" w:cs="Consolas"/>
+          <w:color w:val="A31D1D"/>
+          <w:sz w:val="18"/>
+        </w:rPr>
+        <w:t>attempt_no</w:t>
+      </w:r>
+      <w:r>
+        <w:rPr>
+          <w:rFonts w:ascii="Nirmala UI" w:hAnsi="Nirmala UI" w:eastAsia="Nirmala UI" w:cs="Nirmala UI"/>
+        </w:rPr>
+        <w:t xml:space="preserve">, </w:t>
+      </w:r>
+      <w:r>
+        <w:rPr>
+          <w:rFonts w:ascii="Consolas" w:hAnsi="Consolas" w:eastAsia="Consolas" w:cs="Consolas"/>
+          <w:color w:val="A31D1D"/>
+          <w:sz w:val="18"/>
+        </w:rPr>
+        <w:t>retry_count</w:t>
+      </w:r>
+      <w:r>
+        <w:rPr>
+          <w:rFonts w:ascii="Nirmala UI" w:hAnsi="Nirmala UI" w:eastAsia="Nirmala UI" w:cs="Nirmala UI"/>
+        </w:rPr>
+        <w:t xml:space="preserve"> and the notes line are never</w:t>
+      </w:r>
+    </w:p>
+    <w:p>
+      <w:pPr>
+        <w:spacing w:after="120"/>
+      </w:pPr>
+      <w:r>
+        <w:rPr>
+          <w:rFonts w:ascii="Nirmala UI" w:hAnsi="Nirmala UI" w:eastAsia="Nirmala UI" w:cs="Nirmala UI"/>
+        </w:rPr>
+        <w:t>touched; re-counting attempts every tick is what produced 47 rows and</w:t>
+      </w:r>
+    </w:p>
+    <w:p>
+      <w:pPr>
+        <w:spacing w:after="120"/>
+      </w:pPr>
+      <w:r>
+        <w:rPr>
+          <w:rFonts w:ascii="Nirmala UI" w:hAnsi="Nirmala UI" w:eastAsia="Nirmala UI" w:cs="Nirmala UI"/>
+        </w:rPr>
+        <w:t>retry_count 31 for 3 calls in 006.</w:t>
+      </w:r>
+    </w:p>
+    <w:p>
+      <w:pPr>
+        <w:pStyle w:val="ListBullet"/>
+      </w:pPr>
+      <w:r>
+        <w:rPr>
+          <w:rFonts w:ascii="Nirmala UI" w:hAnsi="Nirmala UI" w:eastAsia="Nirmala UI" w:cs="Nirmala UI"/>
+          <w:b/>
+        </w:rPr>
+        <w:t>`repairIncompleteCallLogs()`</w:t>
+      </w:r>
+      <w:r>
+        <w:rPr>
+          <w:rFonts w:ascii="Nirmala UI" w:hAnsi="Nirmala UI" w:eastAsia="Nirmala UI" w:cs="Nirmala UI"/>
+        </w:rPr>
+        <w:t xml:space="preserve"> finds the damage directly — recent rows with</w:t>
+      </w:r>
+    </w:p>
+    <w:p>
+      <w:pPr>
+        <w:spacing w:after="120"/>
+      </w:pPr>
+      <w:r>
+        <w:rPr>
+          <w:rFonts w:ascii="Nirmala UI" w:hAnsi="Nirmala UI" w:eastAsia="Nirmala UI" w:cs="Nirmala UI"/>
+        </w:rPr>
+        <w:t>no talk time or missing media — and repairs each from its run whatever its</w:t>
+      </w:r>
+    </w:p>
+    <w:p>
+      <w:pPr>
+        <w:spacing w:after="120"/>
+      </w:pPr>
+      <w:r>
+        <w:rPr>
+          <w:rFonts w:ascii="Nirmala UI" w:hAnsi="Nirmala UI" w:eastAsia="Nirmala UI" w:cs="Nirmala UI"/>
+        </w:rPr>
+        <w:t>campaign is doing. Bounded to 7 days and 200 rows per tick.</w:t>
+      </w:r>
+    </w:p>
+    <w:p>
+      <w:pPr>
+        <w:spacing w:after="120"/>
+      </w:pPr>
+      <w:r>
+        <w:rPr>
+          <w:rFonts w:ascii="Nirmala UI" w:hAnsi="Nirmala UI" w:eastAsia="Nirmala UI" w:cs="Nirmala UI"/>
+        </w:rPr>
+        <w:t>A call where Vaani itself extracted nothing (runs 793, 795 — every variable came</w:t>
+      </w:r>
+    </w:p>
+    <w:p>
+      <w:pPr>
+        <w:spacing w:after="120"/>
+      </w:pPr>
+      <w:r>
+        <w:rPr>
+          <w:rFonts w:ascii="Nirmala UI" w:hAnsi="Nirmala UI" w:eastAsia="Nirmala UI" w:cs="Nirmala UI"/>
+        </w:rPr>
+        <w:t xml:space="preserve">back </w:t>
+      </w:r>
+      <w:r>
+        <w:rPr>
+          <w:rFonts w:ascii="Consolas" w:hAnsi="Consolas" w:eastAsia="Consolas" w:cs="Consolas"/>
+          <w:color w:val="A31D1D"/>
+          <w:sz w:val="18"/>
+        </w:rPr>
+        <w:t>""</w:t>
+      </w:r>
+      <w:r>
+        <w:rPr>
+          <w:rFonts w:ascii="Nirmala UI" w:hAnsi="Nirmala UI" w:eastAsia="Nirmala UI" w:cs="Nirmala UI"/>
+        </w:rPr>
+        <w:t>) is left alone. An invented score is worse than an honest blank.</w:t>
+      </w:r>
+    </w:p>
+    <w:p>
+      <w:pPr>
+        <w:pStyle w:val="Heading2"/>
+      </w:pPr>
+      <w:r>
+        <w:rPr>
+          <w:rFonts w:ascii="Nirmala UI" w:hAnsi="Nirmala UI" w:eastAsia="Nirmala UI" w:cs="Nirmala UI"/>
+          <w:color w:val="1F4E79"/>
+        </w:rPr>
+        <w:t>The first sweep found a bug in the fix</w:t>
+      </w:r>
+    </w:p>
+    <w:p>
+      <w:pPr>
+        <w:spacing w:after="120"/>
+      </w:pPr>
+      <w:r>
+        <w:rPr>
+          <w:rFonts w:ascii="Nirmala UI" w:hAnsi="Nirmala UI" w:eastAsia="Nirmala UI" w:cs="Nirmala UI"/>
+        </w:rPr>
+        <w:t xml:space="preserve">It reported </w:t>
+      </w:r>
+      <w:r>
+        <w:rPr>
+          <w:rFonts w:ascii="Consolas" w:hAnsi="Consolas" w:eastAsia="Consolas" w:cs="Consolas"/>
+          <w:color w:val="A31D1D"/>
+          <w:sz w:val="18"/>
+        </w:rPr>
+        <w:t>repaired 2</w:t>
+      </w:r>
+      <w:r>
+        <w:rPr>
+          <w:rFonts w:ascii="Nirmala UI" w:hAnsi="Nirmala UI" w:eastAsia="Nirmala UI" w:cs="Nirmala UI"/>
+        </w:rPr>
+        <w:t xml:space="preserve"> </w:t>
+      </w:r>
+      <w:r>
+        <w:rPr>
+          <w:rFonts w:ascii="Nirmala UI" w:hAnsi="Nirmala UI" w:eastAsia="Nirmala UI" w:cs="Nirmala UI"/>
+          <w:b/>
+        </w:rPr>
+        <w:t>and `errors 6`</w:t>
+      </w:r>
+      <w:r>
+        <w:rPr>
+          <w:rFonts w:ascii="Nirmala UI" w:hAnsi="Nirmala UI" w:eastAsia="Nirmala UI" w:cs="Nirmala UI"/>
+        </w:rPr>
+        <w:t>, and the six were not noise: they</w:t>
+      </w:r>
+    </w:p>
+    <w:p>
+      <w:pPr>
+        <w:spacing w:after="120"/>
+      </w:pPr>
+      <w:r>
+        <w:rPr>
+          <w:rFonts w:ascii="Nirmala UI" w:hAnsi="Nirmala UI" w:eastAsia="Nirmala UI" w:cs="Nirmala UI"/>
+        </w:rPr>
+        <w:t>were the old backend's rows (runs 2091-2097). This pass repairs a row from</w:t>
+      </w:r>
+    </w:p>
+    <w:p>
+      <w:pPr>
+        <w:spacing w:after="120"/>
+      </w:pPr>
+      <w:r>
+        <w:rPr>
+          <w:rFonts w:ascii="Nirmala UI" w:hAnsi="Nirmala UI" w:eastAsia="Nirmala UI" w:cs="Nirmala UI"/>
+        </w:rPr>
+        <w:t>whatever run comes back for its id, and a run id is unique only within one</w:t>
+      </w:r>
+    </w:p>
+    <w:p>
+      <w:pPr>
+        <w:spacing w:after="120"/>
+      </w:pPr>
+      <w:r>
+        <w:rPr>
+          <w:rFonts w:ascii="Nirmala UI" w:hAnsi="Nirmala UI" w:eastAsia="Nirmala UI" w:cs="Nirmala UI"/>
+        </w:rPr>
+        <w:t>backend. Today they merely 404 because Vaani is at ~800 — but when Vaani reaches</w:t>
+      </w:r>
+    </w:p>
+    <w:p>
+      <w:pPr>
+        <w:spacing w:after="120"/>
+      </w:pPr>
+      <w:r>
+        <w:rPr>
+          <w:rFonts w:ascii="Nirmala UI" w:hAnsi="Nirmala UI" w:eastAsia="Nirmala UI" w:cs="Nirmala UI"/>
+        </w:rPr>
+        <w:t xml:space="preserve">2091 they would start returning a </w:t>
+      </w:r>
+      <w:r>
+        <w:rPr>
+          <w:rFonts w:ascii="Nirmala UI" w:hAnsi="Nirmala UI" w:eastAsia="Nirmala UI" w:cs="Nirmala UI"/>
+          <w:b/>
+        </w:rPr>
+        <w:t>different customer's call</w:t>
+      </w:r>
+      <w:r>
+        <w:rPr>
+          <w:rFonts w:ascii="Nirmala UI" w:hAnsi="Nirmala UI" w:eastAsia="Nirmala UI" w:cs="Nirmala UI"/>
+        </w:rPr>
+        <w:t>, merged into an</w:t>
+      </w:r>
+    </w:p>
+    <w:p>
+      <w:pPr>
+        <w:spacing w:after="120"/>
+      </w:pPr>
+      <w:r>
+        <w:rPr>
+          <w:rFonts w:ascii="Nirmala UI" w:hAnsi="Nirmala UI" w:eastAsia="Nirmala UI" w:cs="Nirmala UI"/>
+        </w:rPr>
+        <w:t xml:space="preserve">August row. The same collision </w:t>
+      </w:r>
+      <w:r>
+        <w:rPr>
+          <w:rFonts w:ascii="Consolas" w:hAnsi="Consolas" w:eastAsia="Consolas" w:cs="Consolas"/>
+          <w:color w:val="A31D1D"/>
+          <w:sz w:val="18"/>
+        </w:rPr>
+        <w:t>scripts/009</w:t>
+      </w:r>
+      <w:r>
+        <w:rPr>
+          <w:rFonts w:ascii="Nirmala UI" w:hAnsi="Nirmala UI" w:eastAsia="Nirmala UI" w:cs="Nirmala UI"/>
+        </w:rPr>
+        <w:t xml:space="preserve"> exists for, reintroduced in the new</w:t>
+      </w:r>
+    </w:p>
+    <w:p>
+      <w:pPr>
+        <w:spacing w:after="120"/>
+      </w:pPr>
+      <w:r>
+        <w:rPr>
+          <w:rFonts w:ascii="Nirmala UI" w:hAnsi="Nirmala UI" w:eastAsia="Nirmala UI" w:cs="Nirmala UI"/>
+        </w:rPr>
+        <w:t>repair path.</w:t>
+      </w:r>
+    </w:p>
+    <w:p>
+      <w:pPr>
+        <w:spacing w:after="120"/>
+      </w:pPr>
+      <w:r>
+        <w:rPr>
+          <w:rFonts w:ascii="Nirmala UI" w:hAnsi="Nirmala UI" w:eastAsia="Nirmala UI" w:cs="Nirmala UI"/>
+        </w:rPr>
+        <w:t xml:space="preserve">The candidate query is now scoped by </w:t>
+      </w:r>
+      <w:r>
+        <w:rPr>
+          <w:rFonts w:ascii="Consolas" w:hAnsi="Consolas" w:eastAsia="Consolas" w:cs="Consolas"/>
+          <w:color w:val="A31D1D"/>
+          <w:sz w:val="18"/>
+        </w:rPr>
+        <w:t>provider</w:t>
+      </w:r>
+      <w:r>
+        <w:rPr>
+          <w:rFonts w:ascii="Nirmala UI" w:hAnsi="Nirmala UI" w:eastAsia="Nirmala UI" w:cs="Nirmala UI"/>
+        </w:rPr>
+        <w:t>, and a 404 counts as skipped</w:t>
+      </w:r>
+    </w:p>
+    <w:p>
+      <w:pPr>
+        <w:spacing w:after="120"/>
+      </w:pPr>
+      <w:r>
+        <w:rPr>
+          <w:rFonts w:ascii="Nirmala UI" w:hAnsi="Nirmala UI" w:eastAsia="Nirmala UI" w:cs="Nirmala UI"/>
+        </w:rPr>
+        <w:t>rather than error (six permanent errors a tick would hide a real one). Next</w:t>
+      </w:r>
+    </w:p>
+    <w:p>
+      <w:pPr>
+        <w:spacing w:after="120"/>
+      </w:pPr>
+      <w:r>
+        <w:rPr>
+          <w:rFonts w:ascii="Nirmala UI" w:hAnsi="Nirmala UI" w:eastAsia="Nirmala UI" w:cs="Nirmala UI"/>
+        </w:rPr>
+        <w:t xml:space="preserve">sweep: </w:t>
+      </w:r>
+      <w:r>
+        <w:rPr>
+          <w:rFonts w:ascii="Consolas" w:hAnsi="Consolas" w:eastAsia="Consolas" w:cs="Consolas"/>
+          <w:color w:val="A31D1D"/>
+          <w:sz w:val="18"/>
+        </w:rPr>
+        <w:t>scanned 1, repaired 0, skipped 1, errors 0</w:t>
+      </w:r>
+      <w:r>
+        <w:rPr>
+          <w:rFonts w:ascii="Nirmala UI" w:hAnsi="Nirmala UI" w:eastAsia="Nirmala UI" w:cs="Nirmala UI"/>
+        </w:rPr>
+        <w:t>.</w:t>
+      </w:r>
+    </w:p>
+    <w:p>
+      <w:pPr>
+        <w:pStyle w:val="Heading2"/>
+      </w:pPr>
+      <w:r>
+        <w:rPr>
+          <w:rFonts w:ascii="Nirmala UI" w:hAnsi="Nirmala UI" w:eastAsia="Nirmala UI" w:cs="Nirmala UI"/>
+          <w:color w:val="1F4E79"/>
+        </w:rPr>
+        <w:t>Verified</w:t>
+      </w:r>
+    </w:p>
+    <w:p>
+      <w:pPr>
+        <w:spacing w:after="120"/>
+      </w:pPr>
+      <w:r>
+        <w:rPr>
+          <w:rFonts w:ascii="Nirmala UI" w:hAnsi="Nirmala UI" w:eastAsia="Nirmala UI" w:cs="Nirmala UI"/>
+        </w:rPr>
+        <w:t>All six of 06 Sep's calls now match Vaani exactly:</w:t>
+      </w:r>
+    </w:p>
+    <w:tbl>
+      <w:tblPr>
+        <w:tblStyle w:val="TableGrid"/>
+        <w:tblW w:type="auto" w:w="0"/>
+        <w:jc w:val="center"/>
+        <w:tblLook w:firstColumn="1" w:firstRow="1" w:lastColumn="0" w:lastRow="0" w:noHBand="0" w:noVBand="1" w:val="04A0"/>
+      </w:tblPr>
+      <w:tblGrid>
+        <w:gridCol w:w="1728"/>
+        <w:gridCol w:w="1728"/>
+        <w:gridCol w:w="1728"/>
+        <w:gridCol w:w="1728"/>
+        <w:gridCol w:w="1728"/>
+      </w:tblGrid>
+      <w:tr>
+        <w:tc>
+          <w:tcPr>
+            <w:tcW w:type="dxa" w:w="1728"/>
+            <w:shd w:val="clear" w:color="auto" w:fill="DCE6F1"/>
+          </w:tcPr>
+          <w:p>
+            <w:pPr>
+              <w:spacing w:before="40" w:after="40"/>
+            </w:pPr>
+            <w:r>
+              <w:rPr>
+                <w:rFonts w:ascii="Nirmala UI" w:hAnsi="Nirmala UI" w:eastAsia="Nirmala UI" w:cs="Nirmala UI"/>
+                <w:b/>
+                <w:sz w:val="18"/>
+              </w:rPr>
+              <w:t>run</w:t>
+            </w:r>
+          </w:p>
+        </w:tc>
+        <w:tc>
+          <w:tcPr>
+            <w:tcW w:type="dxa" w:w="1728"/>
+            <w:shd w:val="clear" w:color="auto" w:fill="DCE6F1"/>
+          </w:tcPr>
+          <w:p>
+            <w:pPr>
+              <w:spacing w:before="40" w:after="40"/>
+            </w:pPr>
+            <w:r>
+              <w:rPr>
+                <w:rFonts w:ascii="Nirmala UI" w:hAnsi="Nirmala UI" w:eastAsia="Nirmala UI" w:cs="Nirmala UI"/>
+                <w:b/>
+                <w:sz w:val="18"/>
+              </w:rPr>
+              <w:t>Vaani</w:t>
+            </w:r>
+          </w:p>
+        </w:tc>
+        <w:tc>
+          <w:tcPr>
+            <w:tcW w:type="dxa" w:w="1728"/>
+            <w:shd w:val="clear" w:color="auto" w:fill="DCE6F1"/>
+          </w:tcPr>
+          <w:p>
+            <w:pPr>
+              <w:spacing w:before="40" w:after="40"/>
+            </w:pPr>
+            <w:r>
+              <w:rPr>
+                <w:rFonts w:ascii="Nirmala UI" w:hAnsi="Nirmala UI" w:eastAsia="Nirmala UI" w:cs="Nirmala UI"/>
+                <w:b/>
+                <w:sz w:val="18"/>
+              </w:rPr>
+              <w:t>dashboard</w:t>
+            </w:r>
+          </w:p>
+        </w:tc>
+        <w:tc>
+          <w:tcPr>
+            <w:tcW w:type="dxa" w:w="1728"/>
+            <w:shd w:val="clear" w:color="auto" w:fill="DCE6F1"/>
+          </w:tcPr>
+          <w:p>
+            <w:pPr>
+              <w:spacing w:before="40" w:after="40"/>
+            </w:pPr>
+            <w:r>
+              <w:rPr>
+                <w:rFonts w:ascii="Nirmala UI" w:hAnsi="Nirmala UI" w:eastAsia="Nirmala UI" w:cs="Nirmala UI"/>
+                <w:b/>
+                <w:sz w:val="18"/>
+              </w:rPr>
+              <w:t>rec</w:t>
+            </w:r>
+          </w:p>
+        </w:tc>
+        <w:tc>
+          <w:tcPr>
+            <w:tcW w:type="dxa" w:w="1728"/>
+            <w:shd w:val="clear" w:color="auto" w:fill="DCE6F1"/>
+          </w:tcPr>
+          <w:p>
+            <w:pPr>
+              <w:spacing w:before="40" w:after="40"/>
+            </w:pPr>
+            <w:r>
+              <w:rPr>
+                <w:rFonts w:ascii="Nirmala UI" w:hAnsi="Nirmala UI" w:eastAsia="Nirmala UI" w:cs="Nirmala UI"/>
+                <w:b/>
+                <w:sz w:val="18"/>
+              </w:rPr>
+              <w:t>txt</w:t>
+            </w:r>
+          </w:p>
+        </w:tc>
+      </w:tr>
+      <w:tr>
+        <w:tc>
+          <w:tcPr>
+            <w:tcW w:type="dxa" w:w="1728"/>
+          </w:tcPr>
+          <w:p>
+            <w:pPr>
+              <w:spacing w:before="40" w:after="40"/>
+            </w:pPr>
+            <w:r>
+              <w:rPr>
+                <w:rFonts w:ascii="Nirmala UI" w:hAnsi="Nirmala UI" w:eastAsia="Nirmala UI" w:cs="Nirmala UI"/>
+                <w:sz w:val="18"/>
+              </w:rPr>
+              <w:t>793</w:t>
+            </w:r>
+          </w:p>
+        </w:tc>
+        <w:tc>
+          <w:tcPr>
+            <w:tcW w:type="dxa" w:w="1728"/>
+          </w:tcPr>
+          <w:p>
+            <w:pPr>
+              <w:spacing w:before="40" w:after="40"/>
+            </w:pPr>
+            <w:r>
+              <w:rPr>
+                <w:rFonts w:ascii="Nirmala UI" w:hAnsi="Nirmala UI" w:eastAsia="Nirmala UI" w:cs="Nirmala UI"/>
+                <w:sz w:val="18"/>
+              </w:rPr>
+              <w:t>17s</w:t>
+            </w:r>
+          </w:p>
+        </w:tc>
+        <w:tc>
+          <w:tcPr>
+            <w:tcW w:type="dxa" w:w="1728"/>
+          </w:tcPr>
+          <w:p>
+            <w:pPr>
+              <w:spacing w:before="40" w:after="40"/>
+            </w:pPr>
+            <w:r>
+              <w:rPr>
+                <w:rFonts w:ascii="Nirmala UI" w:hAnsi="Nirmala UI" w:eastAsia="Nirmala UI" w:cs="Nirmala UI"/>
+                <w:sz w:val="18"/>
+              </w:rPr>
+              <w:t>17s</w:t>
+            </w:r>
+          </w:p>
+        </w:tc>
+        <w:tc>
+          <w:tcPr>
+            <w:tcW w:type="dxa" w:w="1728"/>
+          </w:tcPr>
+          <w:p>
+            <w:pPr>
+              <w:spacing w:before="40" w:after="40"/>
+            </w:pPr>
+            <w:r>
+              <w:rPr>
+                <w:rFonts w:ascii="Nirmala UI" w:hAnsi="Nirmala UI" w:eastAsia="Nirmala UI" w:cs="Nirmala UI"/>
+                <w:sz w:val="18"/>
+              </w:rPr>
+              <w:t>Y</w:t>
+            </w:r>
+          </w:p>
+        </w:tc>
+        <w:tc>
+          <w:tcPr>
+            <w:tcW w:type="dxa" w:w="1728"/>
+          </w:tcPr>
+          <w:p>
+            <w:pPr>
+              <w:spacing w:before="40" w:after="40"/>
+            </w:pPr>
+            <w:r>
+              <w:rPr>
+                <w:rFonts w:ascii="Nirmala UI" w:hAnsi="Nirmala UI" w:eastAsia="Nirmala UI" w:cs="Nirmala UI"/>
+                <w:sz w:val="18"/>
+              </w:rPr>
+              <w:t>Y</w:t>
+            </w:r>
+          </w:p>
+        </w:tc>
+      </w:tr>
+      <w:tr>
+        <w:tc>
+          <w:tcPr>
+            <w:tcW w:type="dxa" w:w="1728"/>
+          </w:tcPr>
+          <w:p>
+            <w:pPr>
+              <w:spacing w:before="40" w:after="40"/>
+            </w:pPr>
+            <w:r>
+              <w:rPr>
+                <w:rFonts w:ascii="Nirmala UI" w:hAnsi="Nirmala UI" w:eastAsia="Nirmala UI" w:cs="Nirmala UI"/>
+                <w:sz w:val="18"/>
+              </w:rPr>
+              <w:t>794</w:t>
+            </w:r>
+          </w:p>
+        </w:tc>
+        <w:tc>
+          <w:tcPr>
+            <w:tcW w:type="dxa" w:w="1728"/>
+          </w:tcPr>
+          <w:p>
+            <w:pPr>
+              <w:spacing w:before="40" w:after="40"/>
+            </w:pPr>
+            <w:r>
+              <w:rPr>
+                <w:rFonts w:ascii="Nirmala UI" w:hAnsi="Nirmala UI" w:eastAsia="Nirmala UI" w:cs="Nirmala UI"/>
+                <w:sz w:val="18"/>
+              </w:rPr>
+              <w:t>14s</w:t>
+            </w:r>
+          </w:p>
+        </w:tc>
+        <w:tc>
+          <w:tcPr>
+            <w:tcW w:type="dxa" w:w="1728"/>
+          </w:tcPr>
+          <w:p>
+            <w:pPr>
+              <w:spacing w:before="40" w:after="40"/>
+            </w:pPr>
+            <w:r>
+              <w:rPr>
+                <w:rFonts w:ascii="Nirmala UI" w:hAnsi="Nirmala UI" w:eastAsia="Nirmala UI" w:cs="Nirmala UI"/>
+                <w:sz w:val="18"/>
+              </w:rPr>
+              <w:t>14s</w:t>
+            </w:r>
+          </w:p>
+        </w:tc>
+        <w:tc>
+          <w:tcPr>
+            <w:tcW w:type="dxa" w:w="1728"/>
+          </w:tcPr>
+          <w:p>
+            <w:pPr>
+              <w:spacing w:before="40" w:after="40"/>
+            </w:pPr>
+            <w:r>
+              <w:rPr>
+                <w:rFonts w:ascii="Nirmala UI" w:hAnsi="Nirmala UI" w:eastAsia="Nirmala UI" w:cs="Nirmala UI"/>
+                <w:sz w:val="18"/>
+              </w:rPr>
+              <w:t>Y</w:t>
+            </w:r>
+          </w:p>
+        </w:tc>
+        <w:tc>
+          <w:tcPr>
+            <w:tcW w:type="dxa" w:w="1728"/>
+          </w:tcPr>
+          <w:p>
+            <w:pPr>
+              <w:spacing w:before="40" w:after="40"/>
+            </w:pPr>
+            <w:r>
+              <w:rPr>
+                <w:rFonts w:ascii="Nirmala UI" w:hAnsi="Nirmala UI" w:eastAsia="Nirmala UI" w:cs="Nirmala UI"/>
+                <w:sz w:val="18"/>
+              </w:rPr>
+              <w:t>Y</w:t>
+            </w:r>
+          </w:p>
+        </w:tc>
+      </w:tr>
+      <w:tr>
+        <w:tc>
+          <w:tcPr>
+            <w:tcW w:type="dxa" w:w="1728"/>
+          </w:tcPr>
+          <w:p>
+            <w:pPr>
+              <w:spacing w:before="40" w:after="40"/>
+            </w:pPr>
+            <w:r>
+              <w:rPr>
+                <w:rFonts w:ascii="Nirmala UI" w:hAnsi="Nirmala UI" w:eastAsia="Nirmala UI" w:cs="Nirmala UI"/>
+                <w:sz w:val="18"/>
+              </w:rPr>
+              <w:t>795</w:t>
+            </w:r>
+          </w:p>
+        </w:tc>
+        <w:tc>
+          <w:tcPr>
+            <w:tcW w:type="dxa" w:w="1728"/>
+          </w:tcPr>
+          <w:p>
+            <w:pPr>
+              <w:spacing w:before="40" w:after="40"/>
+            </w:pPr>
+            <w:r>
+              <w:rPr>
+                <w:rFonts w:ascii="Nirmala UI" w:hAnsi="Nirmala UI" w:eastAsia="Nirmala UI" w:cs="Nirmala UI"/>
+                <w:sz w:val="18"/>
+              </w:rPr>
+              <w:t>14s</w:t>
+            </w:r>
+          </w:p>
+        </w:tc>
+        <w:tc>
+          <w:tcPr>
+            <w:tcW w:type="dxa" w:w="1728"/>
+          </w:tcPr>
+          <w:p>
+            <w:pPr>
+              <w:spacing w:before="40" w:after="40"/>
+            </w:pPr>
+            <w:r>
+              <w:rPr>
+                <w:rFonts w:ascii="Nirmala UI" w:hAnsi="Nirmala UI" w:eastAsia="Nirmala UI" w:cs="Nirmala UI"/>
+                <w:sz w:val="18"/>
+              </w:rPr>
+              <w:t>14s</w:t>
+            </w:r>
+          </w:p>
+        </w:tc>
+        <w:tc>
+          <w:tcPr>
+            <w:tcW w:type="dxa" w:w="1728"/>
+          </w:tcPr>
+          <w:p>
+            <w:pPr>
+              <w:spacing w:before="40" w:after="40"/>
+            </w:pPr>
+            <w:r>
+              <w:rPr>
+                <w:rFonts w:ascii="Nirmala UI" w:hAnsi="Nirmala UI" w:eastAsia="Nirmala UI" w:cs="Nirmala UI"/>
+                <w:sz w:val="18"/>
+              </w:rPr>
+              <w:t>Y</w:t>
+            </w:r>
+          </w:p>
+        </w:tc>
+        <w:tc>
+          <w:tcPr>
+            <w:tcW w:type="dxa" w:w="1728"/>
+          </w:tcPr>
+          <w:p>
+            <w:pPr>
+              <w:spacing w:before="40" w:after="40"/>
+            </w:pPr>
+            <w:r>
+              <w:rPr>
+                <w:rFonts w:ascii="Nirmala UI" w:hAnsi="Nirmala UI" w:eastAsia="Nirmala UI" w:cs="Nirmala UI"/>
+                <w:sz w:val="18"/>
+              </w:rPr>
+              <w:t>Y</w:t>
+            </w:r>
+          </w:p>
+        </w:tc>
+      </w:tr>
+      <w:tr>
+        <w:tc>
+          <w:tcPr>
+            <w:tcW w:type="dxa" w:w="1728"/>
+          </w:tcPr>
+          <w:p>
+            <w:pPr>
+              <w:spacing w:before="40" w:after="40"/>
+            </w:pPr>
+            <w:r>
+              <w:rPr>
+                <w:rFonts w:ascii="Nirmala UI" w:hAnsi="Nirmala UI" w:eastAsia="Nirmala UI" w:cs="Nirmala UI"/>
+                <w:sz w:val="18"/>
+              </w:rPr>
+              <w:t>796</w:t>
+            </w:r>
+          </w:p>
+        </w:tc>
+        <w:tc>
+          <w:tcPr>
+            <w:tcW w:type="dxa" w:w="1728"/>
+          </w:tcPr>
+          <w:p>
+            <w:pPr>
+              <w:spacing w:before="40" w:after="40"/>
+            </w:pPr>
+            <w:r>
+              <w:rPr>
+                <w:rFonts w:ascii="Nirmala UI" w:hAnsi="Nirmala UI" w:eastAsia="Nirmala UI" w:cs="Nirmala UI"/>
+                <w:sz w:val="18"/>
+              </w:rPr>
+              <w:t>39s</w:t>
+            </w:r>
+          </w:p>
+        </w:tc>
+        <w:tc>
+          <w:tcPr>
+            <w:tcW w:type="dxa" w:w="1728"/>
+          </w:tcPr>
+          <w:p>
+            <w:pPr>
+              <w:spacing w:before="40" w:after="40"/>
+            </w:pPr>
+            <w:r>
+              <w:rPr>
+                <w:rFonts w:ascii="Nirmala UI" w:hAnsi="Nirmala UI" w:eastAsia="Nirmala UI" w:cs="Nirmala UI"/>
+                <w:sz w:val="18"/>
+              </w:rPr>
+              <w:t>39s</w:t>
+            </w:r>
+          </w:p>
+        </w:tc>
+        <w:tc>
+          <w:tcPr>
+            <w:tcW w:type="dxa" w:w="1728"/>
+          </w:tcPr>
+          <w:p>
+            <w:pPr>
+              <w:spacing w:before="40" w:after="40"/>
+            </w:pPr>
+            <w:r>
+              <w:rPr>
+                <w:rFonts w:ascii="Nirmala UI" w:hAnsi="Nirmala UI" w:eastAsia="Nirmala UI" w:cs="Nirmala UI"/>
+                <w:sz w:val="18"/>
+              </w:rPr>
+              <w:t>Y</w:t>
+            </w:r>
+          </w:p>
+        </w:tc>
+        <w:tc>
+          <w:tcPr>
+            <w:tcW w:type="dxa" w:w="1728"/>
+          </w:tcPr>
+          <w:p>
+            <w:pPr>
+              <w:spacing w:before="40" w:after="40"/>
+            </w:pPr>
+            <w:r>
+              <w:rPr>
+                <w:rFonts w:ascii="Nirmala UI" w:hAnsi="Nirmala UI" w:eastAsia="Nirmala UI" w:cs="Nirmala UI"/>
+                <w:sz w:val="18"/>
+              </w:rPr>
+              <w:t>Y</w:t>
+            </w:r>
+          </w:p>
+        </w:tc>
+      </w:tr>
+      <w:tr>
+        <w:tc>
+          <w:tcPr>
+            <w:tcW w:type="dxa" w:w="1728"/>
+          </w:tcPr>
+          <w:p>
+            <w:pPr>
+              <w:spacing w:before="40" w:after="40"/>
+            </w:pPr>
+            <w:r>
+              <w:rPr>
+                <w:rFonts w:ascii="Nirmala UI" w:hAnsi="Nirmala UI" w:eastAsia="Nirmala UI" w:cs="Nirmala UI"/>
+                <w:sz w:val="18"/>
+              </w:rPr>
+              <w:t>797</w:t>
+            </w:r>
+          </w:p>
+        </w:tc>
+        <w:tc>
+          <w:tcPr>
+            <w:tcW w:type="dxa" w:w="1728"/>
+          </w:tcPr>
+          <w:p>
+            <w:pPr>
+              <w:spacing w:before="40" w:after="40"/>
+            </w:pPr>
+            <w:r>
+              <w:rPr>
+                <w:rFonts w:ascii="Nirmala UI" w:hAnsi="Nirmala UI" w:eastAsia="Nirmala UI" w:cs="Nirmala UI"/>
+                <w:sz w:val="18"/>
+              </w:rPr>
+              <w:t>24s</w:t>
+            </w:r>
+          </w:p>
+        </w:tc>
+        <w:tc>
+          <w:tcPr>
+            <w:tcW w:type="dxa" w:w="1728"/>
+          </w:tcPr>
+          <w:p>
+            <w:pPr>
+              <w:spacing w:before="40" w:after="40"/>
+            </w:pPr>
+            <w:r>
+              <w:rPr>
+                <w:rFonts w:ascii="Nirmala UI" w:hAnsi="Nirmala UI" w:eastAsia="Nirmala UI" w:cs="Nirmala UI"/>
+                <w:sz w:val="18"/>
+              </w:rPr>
+              <w:t>24s</w:t>
+            </w:r>
+          </w:p>
+        </w:tc>
+        <w:tc>
+          <w:tcPr>
+            <w:tcW w:type="dxa" w:w="1728"/>
+          </w:tcPr>
+          <w:p>
+            <w:pPr>
+              <w:spacing w:before="40" w:after="40"/>
+            </w:pPr>
+            <w:r>
+              <w:rPr>
+                <w:rFonts w:ascii="Nirmala UI" w:hAnsi="Nirmala UI" w:eastAsia="Nirmala UI" w:cs="Nirmala UI"/>
+                <w:sz w:val="18"/>
+              </w:rPr>
+              <w:t>Y</w:t>
+            </w:r>
+          </w:p>
+        </w:tc>
+        <w:tc>
+          <w:tcPr>
+            <w:tcW w:type="dxa" w:w="1728"/>
+          </w:tcPr>
+          <w:p>
+            <w:pPr>
+              <w:spacing w:before="40" w:after="40"/>
+            </w:pPr>
+            <w:r>
+              <w:rPr>
+                <w:rFonts w:ascii="Nirmala UI" w:hAnsi="Nirmala UI" w:eastAsia="Nirmala UI" w:cs="Nirmala UI"/>
+                <w:sz w:val="18"/>
+              </w:rPr>
+              <w:t>Y</w:t>
+            </w:r>
+          </w:p>
+        </w:tc>
+      </w:tr>
+      <w:tr>
+        <w:tc>
+          <w:tcPr>
+            <w:tcW w:type="dxa" w:w="1728"/>
+          </w:tcPr>
+          <w:p>
+            <w:pPr>
+              <w:spacing w:before="40" w:after="40"/>
+            </w:pPr>
+            <w:r>
+              <w:rPr>
+                <w:rFonts w:ascii="Nirmala UI" w:hAnsi="Nirmala UI" w:eastAsia="Nirmala UI" w:cs="Nirmala UI"/>
+                <w:sz w:val="18"/>
+              </w:rPr>
+              <w:t>798</w:t>
+            </w:r>
+          </w:p>
+        </w:tc>
+        <w:tc>
+          <w:tcPr>
+            <w:tcW w:type="dxa" w:w="1728"/>
+          </w:tcPr>
+          <w:p>
+            <w:pPr>
+              <w:spacing w:before="40" w:after="40"/>
+            </w:pPr>
+            <w:r>
+              <w:rPr>
+                <w:rFonts w:ascii="Nirmala UI" w:hAnsi="Nirmala UI" w:eastAsia="Nirmala UI" w:cs="Nirmala UI"/>
+                <w:b/>
+                <w:sz w:val="18"/>
+              </w:rPr>
+              <w:t>70s</w:t>
+            </w:r>
+          </w:p>
+        </w:tc>
+        <w:tc>
+          <w:tcPr>
+            <w:tcW w:type="dxa" w:w="1728"/>
+          </w:tcPr>
+          <w:p>
+            <w:pPr>
+              <w:spacing w:before="40" w:after="40"/>
+            </w:pPr>
+            <w:r>
+              <w:rPr>
+                <w:rFonts w:ascii="Nirmala UI" w:hAnsi="Nirmala UI" w:eastAsia="Nirmala UI" w:cs="Nirmala UI"/>
+                <w:b/>
+                <w:sz w:val="18"/>
+              </w:rPr>
+              <w:t>70s</w:t>
+            </w:r>
+          </w:p>
+        </w:tc>
+        <w:tc>
+          <w:tcPr>
+            <w:tcW w:type="dxa" w:w="1728"/>
+          </w:tcPr>
+          <w:p>
+            <w:pPr>
+              <w:spacing w:before="40" w:after="40"/>
+            </w:pPr>
+            <w:r>
+              <w:rPr>
+                <w:rFonts w:ascii="Nirmala UI" w:hAnsi="Nirmala UI" w:eastAsia="Nirmala UI" w:cs="Nirmala UI"/>
+                <w:sz w:val="18"/>
+              </w:rPr>
+              <w:t>Y</w:t>
+            </w:r>
+          </w:p>
+        </w:tc>
+        <w:tc>
+          <w:tcPr>
+            <w:tcW w:type="dxa" w:w="1728"/>
+          </w:tcPr>
+          <w:p>
+            <w:pPr>
+              <w:spacing w:before="40" w:after="40"/>
+            </w:pPr>
+            <w:r>
+              <w:rPr>
+                <w:rFonts w:ascii="Nirmala UI" w:hAnsi="Nirmala UI" w:eastAsia="Nirmala UI" w:cs="Nirmala UI"/>
+                <w:sz w:val="18"/>
+              </w:rPr>
+              <w:t>Y</w:t>
+            </w:r>
+          </w:p>
+        </w:tc>
+      </w:tr>
+    </w:tbl>
+    <w:p/>
+    <w:p>
+      <w:pPr>
+        <w:spacing w:after="120"/>
+      </w:pPr>
+      <w:r>
+        <w:rPr>
+          <w:rFonts w:ascii="Nirmala UI" w:hAnsi="Nirmala UI" w:eastAsia="Nirmala UI" w:cs="Nirmala UI"/>
+        </w:rPr>
+        <w:t xml:space="preserve">Run 798's lead now reads score 100, qualification </w:t>
+      </w:r>
+      <w:r>
+        <w:rPr>
+          <w:rFonts w:ascii="Consolas" w:hAnsi="Consolas" w:eastAsia="Consolas" w:cs="Consolas"/>
+          <w:color w:val="A31D1D"/>
+          <w:sz w:val="18"/>
+        </w:rPr>
+        <w:t>qualified</w:t>
+      </w:r>
+      <w:r>
+        <w:rPr>
+          <w:rFonts w:ascii="Nirmala UI" w:hAnsi="Nirmala UI" w:eastAsia="Nirmala UI" w:cs="Nirmala UI"/>
+        </w:rPr>
+        <w:t xml:space="preserve">, </w:t>
+      </w:r>
+      <w:r>
+        <w:rPr>
+          <w:rFonts w:ascii="Consolas" w:hAnsi="Consolas" w:eastAsia="Consolas" w:cs="Consolas"/>
+          <w:color w:val="A31D1D"/>
+          <w:sz w:val="18"/>
+        </w:rPr>
+        <w:t>house_ownership</w:t>
+      </w:r>
+    </w:p>
+    <w:p>
+      <w:pPr>
+        <w:spacing w:after="120"/>
+      </w:pPr>
+      <w:r>
+        <w:rPr>
+          <w:rFonts w:ascii="Nirmala UI" w:hAnsi="Nirmala UI" w:eastAsia="Nirmala UI" w:cs="Nirmala UI"/>
+        </w:rPr>
+        <w:t xml:space="preserve">own, </w:t>
+      </w:r>
+      <w:r>
+        <w:rPr>
+          <w:rFonts w:ascii="Consolas" w:hAnsi="Consolas" w:eastAsia="Consolas" w:cs="Consolas"/>
+          <w:color w:val="A31D1D"/>
+          <w:sz w:val="18"/>
+        </w:rPr>
+        <w:t>solar_planning</w:t>
+      </w:r>
+      <w:r>
+        <w:rPr>
+          <w:rFonts w:ascii="Nirmala UI" w:hAnsi="Nirmala UI" w:eastAsia="Nirmala UI" w:cs="Nirmala UI"/>
+        </w:rPr>
+        <w:t xml:space="preserve"> true. 75 tests passing.</w:t>
+      </w:r>
+    </w:p>
+    <w:p>
+      <w:pPr>
+        <w:pStyle w:val="Heading2"/>
+      </w:pPr>
+      <w:r>
+        <w:rPr>
+          <w:rFonts w:ascii="Nirmala UI" w:hAnsi="Nirmala UI" w:eastAsia="Nirmala UI" w:cs="Nirmala UI"/>
+          <w:color w:val="1F4E79"/>
+        </w:rPr>
+        <w:t>The account is overdrawn</w:t>
+      </w:r>
+    </w:p>
+    <w:p>
+      <w:pPr>
+        <w:spacing w:after="120"/>
+      </w:pPr>
+      <w:r>
+        <w:rPr>
+          <w:rFonts w:ascii="Consolas" w:hAnsi="Consolas" w:eastAsia="Consolas" w:cs="Consolas"/>
+          <w:color w:val="A31D1D"/>
+          <w:sz w:val="18"/>
+        </w:rPr>
+        <w:t>balance_milli_credits</w:t>
+      </w:r>
+      <w:r>
+        <w:rPr>
+          <w:rFonts w:ascii="Nirmala UI" w:hAnsi="Nirmala UI" w:eastAsia="Nirmala UI" w:cs="Nirmala UI"/>
+        </w:rPr>
+        <w:t xml:space="preserve"> is </w:t>
+      </w:r>
+      <w:r>
+        <w:rPr>
+          <w:rFonts w:ascii="Nirmala UI" w:hAnsi="Nirmala UI" w:eastAsia="Nirmala UI" w:cs="Nirmala UI"/>
+          <w:b/>
+        </w:rPr>
+        <w:t>-24,000</w:t>
+      </w:r>
+      <w:r>
+        <w:rPr>
+          <w:rFonts w:ascii="Nirmala UI" w:hAnsi="Nirmala UI" w:eastAsia="Nirmala UI" w:cs="Nirmala UI"/>
+        </w:rPr>
+        <w:t xml:space="preserve"> (minus 24 credits), against an auto-pause</w:t>
+      </w:r>
+    </w:p>
+    <w:p>
+      <w:pPr>
+        <w:spacing w:after="120"/>
+      </w:pPr>
+      <w:r>
+        <w:rPr>
+          <w:rFonts w:ascii="Nirmala UI" w:hAnsi="Nirmala UI" w:eastAsia="Nirmala UI" w:cs="Nirmala UI"/>
+        </w:rPr>
+        <w:t xml:space="preserve">floor of 20,000. Auto-pause stops </w:t>
+      </w:r>
+      <w:r>
+        <w:rPr>
+          <w:rFonts w:ascii="Nirmala UI" w:hAnsi="Nirmala UI" w:eastAsia="Nirmala UI" w:cs="Nirmala UI"/>
+          <w:i/>
+        </w:rPr>
+        <w:t>campaigns</w:t>
+      </w:r>
+      <w:r>
+        <w:rPr>
+          <w:rFonts w:ascii="Nirmala UI" w:hAnsi="Nirmala UI" w:eastAsia="Nirmala UI" w:cs="Nirmala UI"/>
+        </w:rPr>
+        <w:t>; the per-call pre-flight only</w:t>
+      </w:r>
+    </w:p>
+    <w:p>
+      <w:pPr>
+        <w:spacing w:after="120"/>
+      </w:pPr>
+      <w:r>
+        <w:rPr>
+          <w:rFonts w:ascii="Nirmala UI" w:hAnsi="Nirmala UI" w:eastAsia="Nirmala UI" w:cs="Nirmala UI"/>
+        </w:rPr>
+        <w:t>refuses when the balance is below one minimum charge, so a run of single calls</w:t>
+      </w:r>
+    </w:p>
+    <w:p>
+      <w:pPr>
+        <w:spacing w:after="120"/>
+      </w:pPr>
+      <w:r>
+        <w:rPr>
+          <w:rFonts w:ascii="Nirmala UI" w:hAnsi="Nirmala UI" w:eastAsia="Nirmala UI" w:cs="Nirmala UI"/>
+        </w:rPr>
+        <w:t>walked it past zero. Needs a top-up before handover, and the per-call floor is</w:t>
+      </w:r>
+    </w:p>
+    <w:p>
+      <w:pPr>
+        <w:spacing w:after="120"/>
+      </w:pPr>
+      <w:r>
+        <w:rPr>
+          <w:rFonts w:ascii="Nirmala UI" w:hAnsi="Nirmala UI" w:eastAsia="Nirmala UI" w:cs="Nirmala UI"/>
+        </w:rPr>
+        <w:t>worth revisiting.</w:t>
       </w:r>
     </w:p>
     <w:p>

</xml_diff>